<commit_message>
paper: report the baselines honestly, add graph analysis, thresholds and a Discussion
State the role of language models consistently, define the metrics, replace the
precision table with the baseline comparison, add community analysis, gate and
threshold sensitivity, and a Discussion. Follow each template's own table rules,
caption labels and heading case, and use AIP's reference format in the AIP paper.

Co-Authored-By: Claude Sonnet 5.5 <noreply@anthropic.com>
</commit_message>
<xml_diff>
--- a/paper/Paper_AIP_Conference_Proceedings.docx
+++ b/paper/Paper_AIP_Conference_Proceedings.docx
@@ -143,7 +143,7 @@
         <w:t xml:space="preserve">Abstract.</w:t>
       </w:r>
       <w:r>
-        <w:t xml:space="preserve"> Reading a new subfield means holding thirty papers in mind at once, and the things a researcher most needs to know are rarely stated in any one of them: which papers are really addressing the same question, where two groups report different numbers for what appears to be the same experiment, and what the collection as a whole has never examined. We present a pipeline that recovers these cross-document relationships automatically and, importantly, makes every answer traceable to the sentence that produced it. Papers are segmented by relative font size rather than by matching heading text, which survives the layout variation of real PDFs; typed entities are extracted by rule; and each pair of documents is scored on five interpretable dimensions whose weights sum to one, so a score can always be decomposed. Disagreements are found by comparing reported measurements and by natural language inference, and are confirmed only when the two papers are methodologically comparable. On a corpus of thirty arXiv papers arranged in four topical clusters, segmentation succeeded on all thirty documents and recovered 90% of expected sections; relationship ranking reached 80% precision@10 against a 23% random baseline. Contradiction detection returned no false positives on this corpus, though it also returned no confirmed contradictions, and we examine why. The system requires no language model API and runs offline.</w:t>
+        <w:t xml:space="preserve"> Reading a new subfield means holding thirty papers in mind at once, and what a researcher most needs to know is rarely stated in any one of them: which papers address the same question, where two report different numbers for the same experiment, and what the collection has never examined. We present a pipeline that recovers these cross-document relationships from a folder of PDFs and makes every answer traceable to the sentence that produced it. Papers are segmented by relative font size, typed entities are extracted by rule, each pair of papers is scored on five interpretable dimensions whose weights sum to one, and numeric disagreements are confirmed only when the two papers are comparable. On thirty arXiv papers in four clusters, segmentation succeeded on every paper (215 of 240 sections). The score ranked related papers well above chance (AUC 0.86, MAP 0.68, against 0.50 and 0.31) and above each of its parts, but did not beat full-text TF-IDF (AUC 0.87, MAP 0.78), so its contribution is explanation, not accuracy. The numeric detector found both planted contradictions with no false positive and confirmed none on real papers. Community analysis of the paper network recovered a coarse split into image and language papers. The pipeline runs offline.</w:t>
       </w:r>
     </w:p>
     <w:p>
@@ -175,7 +175,7 @@
         <w:pStyle w:val="Paragraph"/>
       </w:pPr>
       <w:r>
-        <w:t xml:space="preserve">Large language models answer all four fluently, but without provenance: a reviewer cannot check the answer, and a wrong one is indistinguishable in tone from a right one. We took the opposite approach. Every number here decomposes into named components, and every contradiction and gap carries the document, section, page and sentence that produced it. A language model appears only at the end, to phrase findings already established by other means.</w:t>
+        <w:t xml:space="preserve">Large language models can answer questions like these fluently, but without provenance: a reviewer cannot check the answer, and a wrong one reads exactly like a right one. We took a different route. The system described here contains no generative language model. Extraction is rule-based, and the only learned components are two small pretrained encoders used as published: MiniLM for sentence embeddings and a DeBERTa cross-encoder for natural language inference. Every number decomposes into named components, and every contradiction and gap carries the document, section, page and sentence that produced it. The code also has an optional OpenAI backend for extraction and for phrasing explanations. It is off by default and was not used in any experiment reported here.</w:t>
       </w:r>
     </w:p>
     <w:p>
@@ -199,7 +199,7 @@
         <w:pStyle w:val="Paragraphbulleted"/>
       </w:pPr>
       <w:r>
-        <w:t xml:space="preserve">A five-dimensional relationship score with weights constrained to sum to one, which keeps the composite interpretable and lets any ranking be re-derived under different assumptions.</w:t>
+        <w:t xml:space="preserve">A five-dimensional relationship score with weights constrained to sum to one, evaluated against seven baselines and a weight ablation, which shows where the score helps and where plain text similarity is better.</w:t>
       </w:r>
     </w:p>
     <w:p>
@@ -207,7 +207,7 @@
         <w:pStyle w:val="Paragraphbulleted"/>
       </w:pPr>
       <w:r>
-        <w:t xml:space="preserve">A two-detector approach to contradiction detection, combining numeric comparison of reported measurements with natural language inference, gated by a methodological comparability test.</w:t>
+        <w:t xml:space="preserve">Contradiction detection by numeric comparison, with an optional inference model, gated by comparability, with the gates, thresholds and false positives measured.</w:t>
       </w:r>
     </w:p>
     <w:p>
@@ -215,7 +215,7 @@
         <w:pStyle w:val="Paragraphbulleted"/>
       </w:pPr>
       <w:r>
-        <w:t xml:space="preserve">An evaluation corpus of thirty arXiv papers deliberately structured into four clusters so that both true positives and negative controls exist by construction, released with the system.</w:t>
+        <w:t xml:space="preserve">A graph-level analysis, including community structure, over a corpus of thirty arXiv papers in four clusters and a six-paper corpus with planted contradictions.</w:t>
       </w:r>
     </w:p>
     <w:p>
@@ -228,26 +228,10 @@
     </w:p>
     <w:p>
       <w:pPr>
-        <w:pStyle w:val="Heading2"/>
-      </w:pPr>
-      <w:r>
-        <w:t xml:space="preserve">Document representation for scientific text</w:t>
-      </w:r>
-    </w:p>
-    <w:p>
-      <w:pPr>
         <w:pStyle w:val="Paragraph"/>
       </w:pPr>
       <w:r>
-        <w:t xml:space="preserve">Sentence-BERT [1] made dense sentence embeddings cheap to compute over a whole corpus, and SciBERT [2] showed that pretraining on scientific text improves nearly every downstream task in this domain. SPECTER [3] is closest to our scoring component, learning document representations with the citation graph as training signal. All three produce a single vector per document, which is their strength for retrieval and their weakness here: one number for how close two papers are cannot say whether they are close on dataset, method or objective. We keep the dimensions separate for that reason.</w:t>
-      </w:r>
-    </w:p>
-    <w:p>
-      <w:pPr>
-        <w:pStyle w:val="Heading2"/>
-      </w:pPr>
-      <w:r>
-        <w:t xml:space="preserve">Information extraction from papers</w:t>
+        <w:t xml:space="preserve">Sentence-BERT [1] made dense sentence embeddings cheap to compute over a whole corpus, SciBERT [2] adapted pretraining to scientific text, and SPECTER [3] learns document vectors with the citation graph as a training signal. All three give one vector per document, which suits retrieval but cannot say whether two papers are close in dataset, method or objective. We keep the dimensions separate for that reason.</w:t>
       </w:r>
     </w:p>
     <w:p>
@@ -255,15 +239,7 @@
         <w:pStyle w:val="Paragraph"/>
       </w:pPr>
       <w:r>
-        <w:t xml:space="preserve">SciERC [4] annotates abstracts with entities and relations, and DocRED [5] extends relation extraction to the document level. Both need supervision we do not have for our entity types, and both assume text someone has already segmented. That step, which these papers reasonably treat as solved, was the largest single source of failure in our own system.</w:t>
-      </w:r>
-    </w:p>
-    <w:p>
-      <w:pPr>
-        <w:pStyle w:val="Heading2"/>
-      </w:pPr>
-      <w:r>
-        <w:t xml:space="preserve">Claim verification and contradiction</w:t>
+        <w:t xml:space="preserve">SciERC [4] annotates entities and relations in abstracts and DocRED [5] moves relation extraction to whole documents. Both need supervision we do not have and assume text that has already been segmented, which was the largest single source of failure in our own system. FEVER [6] and SciFact [7] verify a claim against retrieved evidence with supervised data; our setting has no labels and needs only the observation that two papers cannot both be right. Models trained on MultiNLI [8] transfer reasonably, hence DeBERTa [9] here, but on sentences dense with figures they are unreliable and numeric comparison is more trustworthy.</w:t>
       </w:r>
     </w:p>
     <w:p>
@@ -271,15 +247,15 @@
         <w:pStyle w:val="Paragraph"/>
       </w:pPr>
       <w:r>
-        <w:t xml:space="preserve">FEVER [6] established claim verification against retrieved evidence and SciFact [7] adapted it to scientific abstracts, both as supervised tasks with annotated claim-evidence pairs. Our setting has no labels, but also does not need a claim verified against the world, only the observation that two papers cannot both be right. Models trained on MultiNLI [8] transfer reasonably, which is why DeBERTa [9] appears here, but on sentences dense with figures they are unreliable and numeric comparison is cheaper and more trustworthy.</w:t>
-      </w:r>
-    </w:p>
-    <w:p>
-      <w:pPr>
-        <w:pStyle w:val="Heading2"/>
-      </w:pPr>
-      <w:r>
-        <w:t xml:space="preserve">Citation analysis</w:t>
+        <w:t xml:space="preserve">Bibliographic coupling [10] and co-citation [11] predate neural methods and remain useful: two papers citing the same prior work are related even when they share no vocabulary. We keep it as one of the five dimensions.</w:t>
+      </w:r>
+    </w:p>
+    <w:p>
+      <w:pPr>
+        <w:pStyle w:val="Heading1"/>
+      </w:pPr>
+      <w:r>
+        <w:t xml:space="preserve">METHOD</w:t>
       </w:r>
     </w:p>
     <w:p>
@@ -287,23 +263,7 @@
         <w:pStyle w:val="Paragraph"/>
       </w:pPr>
       <w:r>
-        <w:t xml:space="preserve">Bibliographic coupling [10] and co-citation [11] predate all of the above by decades and remain useful: two papers citing the same prior work are related even when they share no vocabulary, which is exactly the signal embedding similarity misses. We keep it as one of the five dimensions, at a lower weight.</w:t>
-      </w:r>
-    </w:p>
-    <w:p>
-      <w:pPr>
-        <w:pStyle w:val="Heading1"/>
-      </w:pPr>
-      <w:r>
-        <w:t xml:space="preserve">METHOD</w:t>
-      </w:r>
-    </w:p>
-    <w:p>
-      <w:pPr>
-        <w:pStyle w:val="Paragraph"/>
-      </w:pPr>
-      <w:r>
-        <w:t xml:space="preserve">The pipeline runs eleven stages in a fixed order, shown in Figure 1. The ordering is forced by data dependency rather than chosen: three of the five scoring dimensions are cosine similarities between entity vectors, so embedding has to complete before scoring begins. We learned this the hard way. In an early version the embedding stage silently failed, and because a missing vector yields a similarity of zero rather than an error, the composite score quietly collapsed to its dataset-overlap term while continuing to produce plausible-looking output.</w:t>
+        <w:t xml:space="preserve">The pipeline runs eleven stages in a fixed order, shown in Figure 1. The order is forced by data dependency: three of the five scoring dimensions are cosine similarities between entity vectors, so embedding has to finish before scoring begins. In an early version the embedding stage silently failed, and because a missing vector yields a similarity of zero and not an error, the composite score collapsed to its dataset term while still looking plausible.</w:t>
       </w:r>
     </w:p>
     <w:p>
@@ -315,7 +275,7 @@
           <wp:inline distT="0" distB="0" distL="0" distR="0">
             <wp:extent cx="5029200" cy="2124874"/>
             <wp:effectExtent l="0" t="0" r="0" b="0"/>
-            <wp:docPr id="43788" name="fig1_pipeline.png"/>
+            <wp:docPr id="65991" name="fig1_pipeline.png"/>
             <wp:cNvGraphicFramePr>
               <a:graphicFrameLocks xmlns:a="http://schemas.openxmlformats.org/drawingml/2006/main" noChangeAspect="1"/>
             </wp:cNvGraphicFramePr>
@@ -353,7 +313,13 @@
         <w:pStyle w:val="FigureCaption"/>
       </w:pPr>
       <w:r>
-        <w:t xml:space="preserve">FIGURE 1. The eleven pipeline stages. Ordering is forced by data dependency: three of the five scoring dimensions are cosine similarities over entity vectors, so embedding must precede scoring.</w:t>
+        <w:rPr>
+          <w:b/>
+        </w:rPr>
+        <w:t xml:space="preserve">FIGURE 1. </w:t>
+      </w:r>
+      <w:r>
+        <w:t xml:space="preserve">The eleven pipeline stages. Ordering is forced by data dependency: three of the five scoring dimensions are cosine similarities over entity vectors, so embedding must precede scoring.</w:t>
       </w:r>
     </w:p>
     <w:p>
@@ -361,7 +327,7 @@
         <w:pStyle w:val="Heading2"/>
       </w:pPr>
       <w:r>
-        <w:t xml:space="preserve">Recovering document structure</w:t>
+        <w:t xml:space="preserve">Recovering Document Structure</w:t>
       </w:r>
     </w:p>
     <w:p>
@@ -369,7 +335,15 @@
         <w:pStyle w:val="Paragraph"/>
       </w:pPr>
       <w:r>
-        <w:t xml:space="preserve">A PDF stores positioned glyphs and nothing about sections. Recovering the structure turned out to be the hardest part of this work, and it is worth describing the attempts that failed, since the obvious approaches all do.</w:t>
+        <w:t xml:space="preserve">A PDF stores positioned glyphs and nothing about sections. Matching heading text against a list of names fails because authors disagree on names, looking for bold fails because many templates do not bold headings, and looking for short lines fails on two-column pages. Our first version produced zero sections for one paper and 186 for another. What works is relative font size: we take the character-weighted mode of font sizes as the body size and treat any short, noticeably larger line as a heading candidate, matched against anchored patterns after repairing small-capital artefacts such as I NTRODUCTION. No document is discarded: if no heading is found, the paper is cut into three-page chunks and marked unstructured.</w:t>
+      </w:r>
+    </w:p>
+    <w:p>
+      <w:pPr>
+        <w:pStyle w:val="Heading2"/>
+      </w:pPr>
+      <w:r>
+        <w:t xml:space="preserve">Entity Extraction</w:t>
       </w:r>
     </w:p>
     <w:p>
@@ -377,7 +351,15 @@
         <w:pStyle w:val="Paragraph"/>
       </w:pPr>
       <w:r>
-        <w:t xml:space="preserve">Matching heading text against a list of section names fails because authors do not agree on the names: Background, Prior Work, Literature Review and Related Literature all denote the same section. Looking for bold text fails because headings in many templates are not bold. Looking for short lines fails badly in two-column layouts, where every line is short. Our first working version combined these heuristics and produced zero sections on one paper in the corpus and one hundred and eighty-six on another, from identical code.</w:t>
+        <w:t xml:space="preserve">Entities are extracted by rule: word lists for datasets, metrics and model names, cue phrases for objectives, limitations and stated gaps, and a metric beside a number for a quantitative result. This needs no training data and no language model. Each entity type is accepted only from sections where it plausibly appears; that restriction is suspended for unstructured documents, trading precision for recall. A paper with no methodology section scores zero on that dimension and the weights are not renormalised, because renormalising would make a paper matching on one dimension look like one matching on all five.</w:t>
+      </w:r>
+    </w:p>
+    <w:p>
+      <w:pPr>
+        <w:pStyle w:val="Heading2"/>
+      </w:pPr>
+      <w:r>
+        <w:t xml:space="preserve">Five-dimensional Relationship Scoring</w:t>
       </w:r>
     </w:p>
     <w:p>
@@ -385,74 +367,33 @@
         <w:pStyle w:val="Paragraph"/>
       </w:pPr>
       <w:r>
-        <w:t xml:space="preserve">What does work is relative font size. We take the body size for each document as the character-weighted mode of font sizes on the page, 10.0pt for most of our corpus, and treat any noticeably larger line, typically 12.0pt, as a heading candidate. Being relative to the document rather than absolute, the threshold transfers across house styles. Candidates are matched against anchored patterns covering the synonym sets, after repairing an extraction artefact that renders small-capital headings with a space after the first letter, so I NTRODUCTION reads as INTRODUCTION.</w:t>
-      </w:r>
-    </w:p>
-    <w:p>
-      <w:pPr>
-        <w:pStyle w:val="Paragraph"/>
-      </w:pPr>
-      <w:r>
-        <w:t xml:space="preserve">No document is discarded. If heading detection finds nothing, the paper is divided into three-page chunks marked as unstructured and continues through every later stage. The route taken is recorded on the document, so a degraded result is visible rather than silent.</w:t>
-      </w:r>
-    </w:p>
-    <w:p>
-      <w:pPr>
-        <w:pStyle w:val="Heading2"/>
-      </w:pPr>
-      <w:r>
-        <w:t xml:space="preserve">Entity extraction and the missing-section problem</w:t>
-      </w:r>
-    </w:p>
-    <w:p>
-      <w:pPr>
-        <w:pStyle w:val="Paragraph"/>
-      </w:pPr>
-      <w:r>
-        <w:t xml:space="preserve">Entities are extracted by rule: gazetteers for datasets, metrics and model names, cue-phrase patterns for objectives, limitations and stated gaps, and a metric mention beside a number for a quantitative result. This needs no training data and no API key, a design requirement rather than a convenience, since the system must run on manuscripts that cannot be sent to a third party.</w:t>
-      </w:r>
-    </w:p>
-    <w:p>
-      <w:pPr>
-        <w:pStyle w:val="Paragraph"/>
-      </w:pPr>
-      <w:r>
-        <w:t xml:space="preserve">The section a sentence comes from is evidence about what it contains. An objective is overwhelmingly likely to appear in an abstract, introduction or conclusion, and we use that: each entity type carries an affinity set of sections it may be drawn from. This raises an obvious problem for documents that could not be segmented, where positional evidence does not exist. Our answer is to suspend the restriction entirely for unstructured segments. The trade is deliberate and asymmetric. Such a document loses precision, because its entities are no longer corroborated by position, but it keeps recall and still contributes objectives, methods and results to the analysis.</w:t>
-      </w:r>
-    </w:p>
-    <w:p>
-      <w:pPr>
-        <w:pStyle w:val="Paragraph"/>
-      </w:pPr>
-      <w:r>
-        <w:t xml:space="preserve">A third case remains, where a paper genuinely contains no methodology: an editorial, a position piece, an extended abstract. Here there is nothing to recover and we do not pretend otherwise. The methodology dimension evaluates to zero and the weights are not renormalised over the surviving dimensions. Renormalising is tempting and we rejected it, because it would make a paper matching on a single dimension indistinguishable in score from one matching on all five. The per-dimension scores accompany every composite, so a reader can see which evidence actually existed.</w:t>
-      </w:r>
-    </w:p>
-    <w:p>
-      <w:pPr>
-        <w:pStyle w:val="Heading2"/>
-      </w:pPr>
-      <w:r>
-        <w:t xml:space="preserve">Five-dimensional relationship scoring</w:t>
-      </w:r>
-    </w:p>
-    <w:p>
-      <w:pPr>
-        <w:pStyle w:val="Paragraph"/>
-      </w:pPr>
-      <w:r>
-        <w:t xml:space="preserve">Every pair of documents is scored, giving 435 pairs for a thirty-paper corpus. Each pair is measured on five dimensions that each return a value in [0, 1], combined by a weighted sum as shown in Table 1.</w:t>
+        <w:t xml:space="preserve">Each of the 435 pairs of documents is scored on five dimensions in [0, 1] and combined by a weighted sum (Table 1). The three semantic dimensions are cosine similarities of mean entity embeddings; dataset overlap uses the Jaccard index because dataset names are exact tokens; citation overlap is bibliographic coupling [10], with a direct citation counted as maximal.</w:t>
+      </w:r>
+    </w:p>
+    <w:p>
+      <w:pPr>
+        <w:pStyle w:val="TableCaption"/>
+      </w:pPr>
+      <w:r>
+        <w:rPr>
+          <w:b/>
+        </w:rPr>
+        <w:t xml:space="preserve">TABLE 1. </w:t>
+      </w:r>
+      <w:r>
+        <w:t xml:space="preserve">The five scoring dimensions, their weights, and the measure used for each.</w:t>
       </w:r>
     </w:p>
     <w:tbl>
       <w:tblPr>
-        <w:tblStyle w:val="TableGrid"/>
         <w:tblW w:w="9000" w:type="dxa"/>
-        <w:tblBorders>
-          <w:top w:val="single" w:sz="6" w:color="000000"/>
-          <w:bottom w:val="single" w:sz="6" w:color="000000"/>
-          <w:insideH w:val="single" w:sz="4" w:color="808080"/>
-        </w:tblBorders>
+        <w:jc w:val="center"/>
+        <w:tblLayout w:type="fixed"/>
+        <w:tblCellMar>
+          <w:left w:w="70" w:type="dxa"/>
+          <w:right w:w="70" w:type="dxa"/>
+        </w:tblCellMar>
+        <w:tblLook w:val="0000" w:firstRow="0" w:lastRow="0" w:firstColumn="0" w:lastColumn="0" w:noHBand="0" w:noVBand="0"/>
       </w:tblPr>
       <w:tblGrid>
         <w:gridCol w:w="1980"/>
@@ -462,20 +403,27 @@
       </w:tblGrid>
       <w:tr>
         <w:trPr>
+          <w:cantSplit/>
           <w:tblHeader/>
         </w:trPr>
         <w:tc>
           <w:tcPr>
             <w:tcW w:w="1980" w:type="dxa"/>
-          </w:tcPr>
-          <w:p>
-            <w:pPr>
+            <w:tcBorders>
+              <w:top w:val="single" w:sz="4" w:space="0" w:color="000000"/>
+              <w:bottom w:val="single" w:sz="4" w:space="0" w:color="000000"/>
+            </w:tcBorders>
+          </w:tcPr>
+          <w:p>
+            <w:pPr>
+              <w:ind w:firstLine="0"/>
               <w:jc w:val="left"/>
             </w:pPr>
             <w:r>
               <w:rPr>
                 <w:b/>
                 <w:sz w:val="18"/>
+                <w:szCs w:val="18"/>
               </w:rPr>
               <w:t xml:space="preserve">Dimension</w:t>
             </w:r>
@@ -484,15 +432,21 @@
         <w:tc>
           <w:tcPr>
             <w:tcW w:w="900" w:type="dxa"/>
-          </w:tcPr>
-          <w:p>
-            <w:pPr>
-              <w:jc w:val="left"/>
+            <w:tcBorders>
+              <w:top w:val="single" w:sz="4" w:space="0" w:color="000000"/>
+              <w:bottom w:val="single" w:sz="4" w:space="0" w:color="000000"/>
+            </w:tcBorders>
+          </w:tcPr>
+          <w:p>
+            <w:pPr>
+              <w:ind w:firstLine="0"/>
+              <w:jc w:val="center"/>
             </w:pPr>
             <w:r>
               <w:rPr>
                 <w:b/>
                 <w:sz w:val="18"/>
+                <w:szCs w:val="18"/>
               </w:rPr>
               <w:t xml:space="preserve">Wt.</w:t>
             </w:r>
@@ -501,15 +455,21 @@
         <w:tc>
           <w:tcPr>
             <w:tcW w:w="1170" w:type="dxa"/>
-          </w:tcPr>
-          <w:p>
-            <w:pPr>
-              <w:jc w:val="left"/>
+            <w:tcBorders>
+              <w:top w:val="single" w:sz="4" w:space="0" w:color="000000"/>
+              <w:bottom w:val="single" w:sz="4" w:space="0" w:color="000000"/>
+            </w:tcBorders>
+          </w:tcPr>
+          <w:p>
+            <w:pPr>
+              <w:ind w:firstLine="0"/>
+              <w:jc w:val="center"/>
             </w:pPr>
             <w:r>
               <w:rPr>
                 <w:b/>
                 <w:sz w:val="18"/>
+                <w:szCs w:val="18"/>
               </w:rPr>
               <w:t xml:space="preserve">Measure</w:t>
             </w:r>
@@ -518,15 +478,21 @@
         <w:tc>
           <w:tcPr>
             <w:tcW w:w="4950" w:type="dxa"/>
-          </w:tcPr>
-          <w:p>
-            <w:pPr>
+            <w:tcBorders>
+              <w:top w:val="single" w:sz="4" w:space="0" w:color="000000"/>
+              <w:bottom w:val="single" w:sz="4" w:space="0" w:color="000000"/>
+            </w:tcBorders>
+          </w:tcPr>
+          <w:p>
+            <w:pPr>
+              <w:ind w:firstLine="0"/>
               <w:jc w:val="left"/>
             </w:pPr>
             <w:r>
               <w:rPr>
                 <w:b/>
                 <w:sz w:val="18"/>
+                <w:szCs w:val="18"/>
               </w:rPr>
               <w:t xml:space="preserve">Compares</w:t>
             </w:r>
@@ -534,17 +500,22 @@
         </w:tc>
       </w:tr>
       <w:tr>
+        <w:trPr>
+          <w:cantSplit/>
+        </w:trPr>
         <w:tc>
           <w:tcPr>
             <w:tcW w:w="1980" w:type="dxa"/>
           </w:tcPr>
           <w:p>
             <w:pPr>
+              <w:ind w:firstLine="0"/>
               <w:jc w:val="left"/>
             </w:pPr>
             <w:r>
               <w:rPr>
-                <w:sz w:val="18"/>
+                <w:sz w:val="20"/>
+                <w:szCs w:val="20"/>
               </w:rPr>
               <w:t xml:space="preserve">Objective</w:t>
             </w:r>
@@ -556,43 +527,49 @@
           </w:tcPr>
           <w:p>
             <w:pPr>
+              <w:ind w:firstLine="0"/>
+              <w:jc w:val="center"/>
+            </w:pPr>
+            <w:r>
+              <w:rPr>
+                <w:sz w:val="20"/>
+                <w:szCs w:val="20"/>
+              </w:rPr>
+              <w:t xml:space="preserve">0.25</w:t>
+            </w:r>
+          </w:p>
+        </w:tc>
+        <w:tc>
+          <w:tcPr>
+            <w:tcW w:w="1170" w:type="dxa"/>
+          </w:tcPr>
+          <w:p>
+            <w:pPr>
+              <w:ind w:firstLine="0"/>
+              <w:jc w:val="center"/>
+            </w:pPr>
+            <w:r>
+              <w:rPr>
+                <w:sz w:val="20"/>
+                <w:szCs w:val="20"/>
+              </w:rPr>
+              <w:t xml:space="preserve">Cosine</w:t>
+            </w:r>
+          </w:p>
+        </w:tc>
+        <w:tc>
+          <w:tcPr>
+            <w:tcW w:w="4950" w:type="dxa"/>
+          </w:tcPr>
+          <w:p>
+            <w:pPr>
+              <w:ind w:firstLine="0"/>
               <w:jc w:val="left"/>
             </w:pPr>
             <w:r>
               <w:rPr>
-                <w:sz w:val="18"/>
-              </w:rPr>
-              <w:t xml:space="preserve">0.25</w:t>
-            </w:r>
-          </w:p>
-        </w:tc>
-        <w:tc>
-          <w:tcPr>
-            <w:tcW w:w="1170" w:type="dxa"/>
-          </w:tcPr>
-          <w:p>
-            <w:pPr>
-              <w:jc w:val="left"/>
-            </w:pPr>
-            <w:r>
-              <w:rPr>
-                <w:sz w:val="18"/>
-              </w:rPr>
-              <w:t xml:space="preserve">Cosine</w:t>
-            </w:r>
-          </w:p>
-        </w:tc>
-        <w:tc>
-          <w:tcPr>
-            <w:tcW w:w="4950" w:type="dxa"/>
-          </w:tcPr>
-          <w:p>
-            <w:pPr>
-              <w:jc w:val="left"/>
-            </w:pPr>
-            <w:r>
-              <w:rPr>
-                <w:sz w:val="18"/>
+                <w:sz w:val="20"/>
+                <w:szCs w:val="20"/>
               </w:rPr>
               <w:t xml:space="preserve">Mean embedding of objective statements</w:t>
             </w:r>
@@ -600,17 +577,22 @@
         </w:tc>
       </w:tr>
       <w:tr>
+        <w:trPr>
+          <w:cantSplit/>
+        </w:trPr>
         <w:tc>
           <w:tcPr>
             <w:tcW w:w="1980" w:type="dxa"/>
           </w:tcPr>
           <w:p>
             <w:pPr>
+              <w:ind w:firstLine="0"/>
               <w:jc w:val="left"/>
             </w:pPr>
             <w:r>
               <w:rPr>
-                <w:sz w:val="18"/>
+                <w:sz w:val="20"/>
+                <w:szCs w:val="20"/>
               </w:rPr>
               <w:t xml:space="preserve">Methodology</w:t>
             </w:r>
@@ -622,43 +604,49 @@
           </w:tcPr>
           <w:p>
             <w:pPr>
+              <w:ind w:firstLine="0"/>
+              <w:jc w:val="center"/>
+            </w:pPr>
+            <w:r>
+              <w:rPr>
+                <w:sz w:val="20"/>
+                <w:szCs w:val="20"/>
+              </w:rPr>
+              <w:t xml:space="preserve">0.25</w:t>
+            </w:r>
+          </w:p>
+        </w:tc>
+        <w:tc>
+          <w:tcPr>
+            <w:tcW w:w="1170" w:type="dxa"/>
+          </w:tcPr>
+          <w:p>
+            <w:pPr>
+              <w:ind w:firstLine="0"/>
+              <w:jc w:val="center"/>
+            </w:pPr>
+            <w:r>
+              <w:rPr>
+                <w:sz w:val="20"/>
+                <w:szCs w:val="20"/>
+              </w:rPr>
+              <w:t xml:space="preserve">Cosine</w:t>
+            </w:r>
+          </w:p>
+        </w:tc>
+        <w:tc>
+          <w:tcPr>
+            <w:tcW w:w="4950" w:type="dxa"/>
+          </w:tcPr>
+          <w:p>
+            <w:pPr>
+              <w:ind w:firstLine="0"/>
               <w:jc w:val="left"/>
             </w:pPr>
             <w:r>
               <w:rPr>
-                <w:sz w:val="18"/>
-              </w:rPr>
-              <w:t xml:space="preserve">0.25</w:t>
-            </w:r>
-          </w:p>
-        </w:tc>
-        <w:tc>
-          <w:tcPr>
-            <w:tcW w:w="1170" w:type="dxa"/>
-          </w:tcPr>
-          <w:p>
-            <w:pPr>
-              <w:jc w:val="left"/>
-            </w:pPr>
-            <w:r>
-              <w:rPr>
-                <w:sz w:val="18"/>
-              </w:rPr>
-              <w:t xml:space="preserve">Cosine</w:t>
-            </w:r>
-          </w:p>
-        </w:tc>
-        <w:tc>
-          <w:tcPr>
-            <w:tcW w:w="4950" w:type="dxa"/>
-          </w:tcPr>
-          <w:p>
-            <w:pPr>
-              <w:jc w:val="left"/>
-            </w:pPr>
-            <w:r>
-              <w:rPr>
-                <w:sz w:val="18"/>
+                <w:sz w:val="20"/>
+                <w:szCs w:val="20"/>
               </w:rPr>
               <w:t xml:space="preserve">Mean embedding of method entities</w:t>
             </w:r>
@@ -666,17 +654,22 @@
         </w:tc>
       </w:tr>
       <w:tr>
+        <w:trPr>
+          <w:cantSplit/>
+        </w:trPr>
         <w:tc>
           <w:tcPr>
             <w:tcW w:w="1980" w:type="dxa"/>
           </w:tcPr>
           <w:p>
             <w:pPr>
+              <w:ind w:firstLine="0"/>
               <w:jc w:val="left"/>
             </w:pPr>
             <w:r>
               <w:rPr>
-                <w:sz w:val="18"/>
+                <w:sz w:val="20"/>
+                <w:szCs w:val="20"/>
               </w:rPr>
               <w:t xml:space="preserve">Dataset</w:t>
             </w:r>
@@ -688,43 +681,49 @@
           </w:tcPr>
           <w:p>
             <w:pPr>
+              <w:ind w:firstLine="0"/>
+              <w:jc w:val="center"/>
+            </w:pPr>
+            <w:r>
+              <w:rPr>
+                <w:sz w:val="20"/>
+                <w:szCs w:val="20"/>
+              </w:rPr>
+              <w:t xml:space="preserve">0.20</w:t>
+            </w:r>
+          </w:p>
+        </w:tc>
+        <w:tc>
+          <w:tcPr>
+            <w:tcW w:w="1170" w:type="dxa"/>
+          </w:tcPr>
+          <w:p>
+            <w:pPr>
+              <w:ind w:firstLine="0"/>
+              <w:jc w:val="center"/>
+            </w:pPr>
+            <w:r>
+              <w:rPr>
+                <w:sz w:val="20"/>
+                <w:szCs w:val="20"/>
+              </w:rPr>
+              <w:t xml:space="preserve">Jaccard</w:t>
+            </w:r>
+          </w:p>
+        </w:tc>
+        <w:tc>
+          <w:tcPr>
+            <w:tcW w:w="4950" w:type="dxa"/>
+          </w:tcPr>
+          <w:p>
+            <w:pPr>
+              <w:ind w:firstLine="0"/>
               <w:jc w:val="left"/>
             </w:pPr>
             <w:r>
               <w:rPr>
-                <w:sz w:val="18"/>
-              </w:rPr>
-              <w:t xml:space="preserve">0.20</w:t>
-            </w:r>
-          </w:p>
-        </w:tc>
-        <w:tc>
-          <w:tcPr>
-            <w:tcW w:w="1170" w:type="dxa"/>
-          </w:tcPr>
-          <w:p>
-            <w:pPr>
-              <w:jc w:val="left"/>
-            </w:pPr>
-            <w:r>
-              <w:rPr>
-                <w:sz w:val="18"/>
-              </w:rPr>
-              <w:t xml:space="preserve">Jaccard</w:t>
-            </w:r>
-          </w:p>
-        </w:tc>
-        <w:tc>
-          <w:tcPr>
-            <w:tcW w:w="4950" w:type="dxa"/>
-          </w:tcPr>
-          <w:p>
-            <w:pPr>
-              <w:jc w:val="left"/>
-            </w:pPr>
-            <w:r>
-              <w:rPr>
-                <w:sz w:val="18"/>
+                <w:sz w:val="20"/>
+                <w:szCs w:val="20"/>
               </w:rPr>
               <w:t xml:space="preserve">Sets of dataset names</w:t>
             </w:r>
@@ -732,17 +731,22 @@
         </w:tc>
       </w:tr>
       <w:tr>
+        <w:trPr>
+          <w:cantSplit/>
+        </w:trPr>
         <w:tc>
           <w:tcPr>
             <w:tcW w:w="1980" w:type="dxa"/>
           </w:tcPr>
           <w:p>
             <w:pPr>
+              <w:ind w:firstLine="0"/>
               <w:jc w:val="left"/>
             </w:pPr>
             <w:r>
               <w:rPr>
-                <w:sz w:val="18"/>
+                <w:sz w:val="20"/>
+                <w:szCs w:val="20"/>
               </w:rPr>
               <w:t xml:space="preserve">Results and metrics</w:t>
             </w:r>
@@ -754,43 +758,49 @@
           </w:tcPr>
           <w:p>
             <w:pPr>
+              <w:ind w:firstLine="0"/>
+              <w:jc w:val="center"/>
+            </w:pPr>
+            <w:r>
+              <w:rPr>
+                <w:sz w:val="20"/>
+                <w:szCs w:val="20"/>
+              </w:rPr>
+              <w:t xml:space="preserve">0.20</w:t>
+            </w:r>
+          </w:p>
+        </w:tc>
+        <w:tc>
+          <w:tcPr>
+            <w:tcW w:w="1170" w:type="dxa"/>
+          </w:tcPr>
+          <w:p>
+            <w:pPr>
+              <w:ind w:firstLine="0"/>
+              <w:jc w:val="center"/>
+            </w:pPr>
+            <w:r>
+              <w:rPr>
+                <w:sz w:val="20"/>
+                <w:szCs w:val="20"/>
+              </w:rPr>
+              <w:t xml:space="preserve">Cosine</w:t>
+            </w:r>
+          </w:p>
+        </w:tc>
+        <w:tc>
+          <w:tcPr>
+            <w:tcW w:w="4950" w:type="dxa"/>
+          </w:tcPr>
+          <w:p>
+            <w:pPr>
+              <w:ind w:firstLine="0"/>
               <w:jc w:val="left"/>
             </w:pPr>
             <w:r>
               <w:rPr>
-                <w:sz w:val="18"/>
-              </w:rPr>
-              <w:t xml:space="preserve">0.20</w:t>
-            </w:r>
-          </w:p>
-        </w:tc>
-        <w:tc>
-          <w:tcPr>
-            <w:tcW w:w="1170" w:type="dxa"/>
-          </w:tcPr>
-          <w:p>
-            <w:pPr>
-              <w:jc w:val="left"/>
-            </w:pPr>
-            <w:r>
-              <w:rPr>
-                <w:sz w:val="18"/>
-              </w:rPr>
-              <w:t xml:space="preserve">Cosine</w:t>
-            </w:r>
-          </w:p>
-        </w:tc>
-        <w:tc>
-          <w:tcPr>
-            <w:tcW w:w="4950" w:type="dxa"/>
-          </w:tcPr>
-          <w:p>
-            <w:pPr>
-              <w:jc w:val="left"/>
-            </w:pPr>
-            <w:r>
-              <w:rPr>
-                <w:sz w:val="18"/>
+                <w:sz w:val="20"/>
+                <w:szCs w:val="20"/>
               </w:rPr>
               <w:t xml:space="preserve">Reported results and evaluation metrics</w:t>
             </w:r>
@@ -798,17 +808,25 @@
         </w:tc>
       </w:tr>
       <w:tr>
+        <w:trPr>
+          <w:cantSplit/>
+        </w:trPr>
         <w:tc>
           <w:tcPr>
             <w:tcW w:w="1980" w:type="dxa"/>
-          </w:tcPr>
-          <w:p>
-            <w:pPr>
+            <w:tcBorders>
+              <w:bottom w:val="single" w:sz="4" w:space="0" w:color="000000"/>
+            </w:tcBorders>
+          </w:tcPr>
+          <w:p>
+            <w:pPr>
+              <w:ind w:firstLine="0"/>
               <w:jc w:val="left"/>
             </w:pPr>
             <w:r>
               <w:rPr>
-                <w:sz w:val="18"/>
+                <w:sz w:val="20"/>
+                <w:szCs w:val="20"/>
               </w:rPr>
               <w:t xml:space="preserve">Citation</w:t>
             </w:r>
@@ -817,46 +835,61 @@
         <w:tc>
           <w:tcPr>
             <w:tcW w:w="900" w:type="dxa"/>
-          </w:tcPr>
-          <w:p>
-            <w:pPr>
+            <w:tcBorders>
+              <w:bottom w:val="single" w:sz="4" w:space="0" w:color="000000"/>
+            </w:tcBorders>
+          </w:tcPr>
+          <w:p>
+            <w:pPr>
+              <w:ind w:firstLine="0"/>
+              <w:jc w:val="center"/>
+            </w:pPr>
+            <w:r>
+              <w:rPr>
+                <w:sz w:val="20"/>
+                <w:szCs w:val="20"/>
+              </w:rPr>
+              <w:t xml:space="preserve">0.10</w:t>
+            </w:r>
+          </w:p>
+        </w:tc>
+        <w:tc>
+          <w:tcPr>
+            <w:tcW w:w="1170" w:type="dxa"/>
+            <w:tcBorders>
+              <w:bottom w:val="single" w:sz="4" w:space="0" w:color="000000"/>
+            </w:tcBorders>
+          </w:tcPr>
+          <w:p>
+            <w:pPr>
+              <w:ind w:firstLine="0"/>
+              <w:jc w:val="center"/>
+            </w:pPr>
+            <w:r>
+              <w:rPr>
+                <w:sz w:val="20"/>
+                <w:szCs w:val="20"/>
+              </w:rPr>
+              <w:t xml:space="preserve">Jaccard</w:t>
+            </w:r>
+          </w:p>
+        </w:tc>
+        <w:tc>
+          <w:tcPr>
+            <w:tcW w:w="4950" w:type="dxa"/>
+            <w:tcBorders>
+              <w:bottom w:val="single" w:sz="4" w:space="0" w:color="000000"/>
+            </w:tcBorders>
+          </w:tcPr>
+          <w:p>
+            <w:pPr>
+              <w:ind w:firstLine="0"/>
               <w:jc w:val="left"/>
             </w:pPr>
             <w:r>
               <w:rPr>
-                <w:sz w:val="18"/>
-              </w:rPr>
-              <w:t xml:space="preserve">0.10</w:t>
-            </w:r>
-          </w:p>
-        </w:tc>
-        <w:tc>
-          <w:tcPr>
-            <w:tcW w:w="1170" w:type="dxa"/>
-          </w:tcPr>
-          <w:p>
-            <w:pPr>
-              <w:jc w:val="left"/>
-            </w:pPr>
-            <w:r>
-              <w:rPr>
-                <w:sz w:val="18"/>
-              </w:rPr>
-              <w:t xml:space="preserve">Jaccard</w:t>
-            </w:r>
-          </w:p>
-        </w:tc>
-        <w:tc>
-          <w:tcPr>
-            <w:tcW w:w="4950" w:type="dxa"/>
-          </w:tcPr>
-          <w:p>
-            <w:pPr>
-              <w:jc w:val="left"/>
-            </w:pPr>
-            <w:r>
-              <w:rPr>
-                <w:sz w:val="18"/>
+                <w:sz w:val="20"/>
+                <w:szCs w:val="20"/>
               </w:rPr>
               <w:t xml:space="preserve">Reference lists (bibliographic coupling)</w:t>
             </w:r>
@@ -867,18 +900,18 @@
     <w:p/>
     <w:p>
       <w:pPr>
-        <w:pStyle w:val="TableCaption"/>
-      </w:pPr>
-      <w:r>
-        <w:t xml:space="preserve">Table 1. The five scoring dimensions, their weights, and the measure used for each.</w:t>
-      </w:r>
-    </w:p>
-    <w:p>
-      <w:pPr>
         <w:pStyle w:val="Paragraph"/>
       </w:pPr>
       <w:r>
-        <w:t xml:space="preserve">The three semantic dimensions compare mean entity embeddings by cosine similarity. The dataset dimension does not: dataset names are exact tokens, so a set-overlap measure is more appropriate than a distributional one, and we use the Jaccard index. Citation overlap is bibliographic coupling over parsed reference lists, with a direct citation between the two documents treated as maximal.</w:t>
+        <w:t xml:space="preserve">The weights are a stated prior that we chose, not a fitted parameter. They are validated at start-up to sum to exactly 1.0 and can be changed at run time. Cosine similarity is clamped to [0, 1], since opposite vectors mean unrelated and not anti-related. Before we did this, negative similarities were rejected by the data model and 203 of 435 pairs were dropped without any error.</w:t>
+      </w:r>
+    </w:p>
+    <w:p>
+      <w:pPr>
+        <w:pStyle w:val="Heading2"/>
+      </w:pPr>
+      <w:r>
+        <w:t xml:space="preserve">Contradiction Detection</w:t>
       </w:r>
     </w:p>
     <w:p>
@@ -886,7 +919,15 @@
         <w:pStyle w:val="Paragraph"/>
       </w:pPr>
       <w:r>
-        <w:t xml:space="preserve">The weights are a stated prior, not a learned parameter, and we want to be explicit about that. They encode three judgements: that what a paper is trying to do and how it does it jointly make it that paper, hence half the mass; that datasets and metrics are concrete, checkable common ground, hence 0.40; and that shared citations are genuine but lagging evidence, since a paper cannot cite work published after it. Two properties keep this from being arbitrary. The configuration is validated at startup to sum to exactly 1.0, and the system refuses to run otherwise, so the composite stays in [0, 1] and comparable across runs; and the weights are adjustable at runtime, so any ranking can be recomputed under a different prior.</w:t>
+        <w:t xml:space="preserve">A numeric detector compares the values two papers report for the same metric on the same dataset and flags a relative difference above 5%. An optional inference detector passes two claim sentences to a cross-encoder as a pair. Before any number is compared, the claim is analysed: a delta is not a level, a figure quoted from another paper is not the paper's own, and top-1 is not top-5. A finding is confirmed only if the stance is contradiction, confidence is at least 0.60, the papers share a dataset or comparable metric, and their methodology similarity is at least 0.30. Findings that fail are kept as unconfirmed.</w:t>
+      </w:r>
+    </w:p>
+    <w:p>
+      <w:pPr>
+        <w:pStyle w:val="Heading2"/>
+      </w:pPr>
+      <w:r>
+        <w:t xml:space="preserve">Research Gap Discovery</w:t>
       </w:r>
     </w:p>
     <w:p>
@@ -894,7 +935,7 @@
         <w:pStyle w:val="Paragraph"/>
       </w:pPr>
       <w:r>
-        <w:t xml:space="preserve">One implementation detail cost us several days and is worth recording. Cosine similarity ranges over [-1, 1], but relatedness does not; two documents pointing in opposite directions in vector space are unrelated rather than negatively related. Before we clamped the value, negative similarities were rejected by the data model's range constraint, and 203 of 435 pairs were being dropped from the results without any error being raised. The fix is a single line. Finding it required counting the output rather than reading the code.</w:t>
+        <w:t xml:space="preserve">Three kinds of absence are detected: gaps the authors state outright, gaps where papers share a concept but are otherwise dissimilar, and pairings of a method and a dataset that never occur together. Candidates are ranked by importance and at most five are returned. An early version returned about sixty.</w:t>
       </w:r>
     </w:p>
     <w:p>
@@ -902,7 +943,7 @@
         <w:pStyle w:val="Heading2"/>
       </w:pPr>
       <w:r>
-        <w:t xml:space="preserve">Contradiction detection</w:t>
+        <w:t xml:space="preserve">Thresholds</w:t>
       </w:r>
     </w:p>
     <w:p>
@@ -910,63 +951,7 @@
         <w:pStyle w:val="Paragraph"/>
       </w:pPr>
       <w:r>
-        <w:t xml:space="preserve">Two detectors run and their verdicts are merged, because they fail in different places. The numeric detector parses the values two papers report, verifies that they measure the same metric on the same dataset under conditions that do not conflict, and flags a material difference. It uses no model at all. The inference detector presents two claim sentences to a cross-encoder as a genuine sentence pair and reads off the stance.</w:t>
-      </w:r>
-    </w:p>
-    <w:p>
-      <w:pPr>
-        <w:pStyle w:val="Paragraph"/>
-      </w:pPr>
-      <w:r>
-        <w:t xml:space="preserve">Flagging is cheap and being right is not, so confirmation requires four conditions to hold at once: the stance is contradiction, confidence is at least 0.60, the two papers share a dataset or have comparable metrics, and their methodology similarity is at least 0.30. Everything else is reported as unconfirmed rather than suppressed. The methodology condition is what eliminates the dominant false positive, in which two papers report different numbers for the straightforward reason that they measured different things.</w:t>
-      </w:r>
-    </w:p>
-    <w:p>
-      <w:pPr>
-        <w:pStyle w:val="Paragraph"/>
-      </w:pPr>
-      <w:r>
-        <w:t xml:space="preserve">Documents, entities and bridge concepts are held in a directed multigraph built with NetworkX [18]. Candidate pairs are restricted to documents sharing a bridge concept or score above a relatedness threshold. Unrelated papers cannot contradict one another, and the restriction keeps this stage from becoming quadratic in corpus size.</w:t>
-      </w:r>
-    </w:p>
-    <w:p>
-      <w:pPr>
-        <w:pStyle w:val="Heading2"/>
-      </w:pPr>
-      <w:r>
-        <w:t xml:space="preserve">Research gap discovery</w:t>
-      </w:r>
-    </w:p>
-    <w:p>
-      <w:pPr>
-        <w:pStyle w:val="Paragraph"/>
-      </w:pPr>
-      <w:r>
-        <w:t xml:space="preserve">Three kinds of absence are detected and they are not treated as equally credible. A stated gap is one an author declares outright, and phrases such as "to the best of our knowledge" or "remains unexplored" score above a vague gesture toward future work. A weak-connection gap arises where several papers share a specific concept yet score poorly against one another otherwise, suggesting a subject approached from disconnected directions. An absent pairing is a combination of two concepts that no paper in the corpus has made.</w:t>
-      </w:r>
-    </w:p>
-    <w:p>
-      <w:pPr>
-        <w:pStyle w:val="Paragraph"/>
-      </w:pPr>
-      <w:r>
-        <w:t xml:space="preserve">Absent pairings are much the weakest evidence, since most pairs of concepts have never been combined and most never should be. We require both concept communities to hold at least three papers, not to overlap already, and to be related to each other: if the papers using X have nothing to do with those using Y, nobody combining them carries no information. At most one such gap reaches the final list.</w:t>
-      </w:r>
-    </w:p>
-    <w:p>
-      <w:pPr>
-        <w:pStyle w:val="Paragraph"/>
-      </w:pPr>
-      <w:r>
-        <w:t xml:space="preserve">An early version of this stage returned around sixty gaps. That is not a findings list but a haystack, and a reader skims it and trusts none of it. Ranking candidates by importance and returning at most five above a high floor produced output that a person will actually read, which we regard as the more useful behaviour even though it lowers recall.</w:t>
-      </w:r>
-    </w:p>
-    <w:p>
-      <w:pPr>
-        <w:pStyle w:val="Paragraph"/>
-      </w:pPr>
-      <w:r>
-        <w:t xml:space="preserve">Findings are presented in a browser interface, shown in Figure 2, which is how a reader actually works with them: the graph can be explored, a selected paper dims everything outside its neighbourhood, and every pair score can be opened to see the five dimensions it was built from.</w:t>
+        <w:t xml:space="preserve">We state how each threshold was set. The methodology similarity (0.30) and the confidence (0.60) needed to confirm a contradiction were fixed at design time from the requirements. The 5% materiality threshold and the candidate-pair score (0.35) were chosen by us a priori. The gap thresholds and the heading margin were set by running the pipeline on the development papers and adjusting until the output was usable. None was fitted by search against labels, because there were none. Two consequences follow. The thresholds set by inspection were set while looking at the papers we evaluate on, so results on that corpus are not held-out. And the useful question is how far results move when a threshold moves, which the sensitivity analysis below measures.</w:t>
       </w:r>
     </w:p>
     <w:p>
@@ -978,7 +963,7 @@
           <wp:inline distT="0" distB="0" distL="0" distR="0">
             <wp:extent cx="4754880" cy="3261731"/>
             <wp:effectExtent l="0" t="0" r="0" b="0"/>
-            <wp:docPr id="80239" name="fig2_workspace.png"/>
+            <wp:docPr id="82737" name="fig2_workspace.png"/>
             <wp:cNvGraphicFramePr>
               <a:graphicFrameLocks xmlns:a="http://schemas.openxmlformats.org/drawingml/2006/main" noChangeAspect="1"/>
             </wp:cNvGraphicFramePr>
@@ -1016,7 +1001,13 @@
         <w:pStyle w:val="FigureCaption"/>
       </w:pPr>
       <w:r>
-        <w:t xml:space="preserve">FIGURE 2. The analysis workspace. Above, the headline counts, the knowledge graph with one paper selected - selection dims everything outside its neighbourhood - and the inspector. Below, the composite score for every pair of papers, which the reader can sort and inspect cell by cell.</w:t>
+        <w:rPr>
+          <w:b/>
+        </w:rPr>
+        <w:t xml:space="preserve">FIGURE 2. </w:t>
+      </w:r>
+      <w:r>
+        <w:t xml:space="preserve">The analysis workspace. Above, the headline counts, the knowledge graph with one paper selected and the inspector. Below, the composite score for every pair of papers.</w:t>
       </w:r>
     </w:p>
     <w:p>
@@ -1024,7 +1015,7 @@
         <w:pStyle w:val="Heading1"/>
       </w:pPr>
       <w:r>
-        <w:t xml:space="preserve">EVALUATION CORPUS</w:t>
+        <w:t xml:space="preserve">EVALUATION CORPUS AND PROTOCOL</w:t>
       </w:r>
     </w:p>
     <w:p>
@@ -1032,7 +1023,7 @@
         <w:pStyle w:val="Paragraph"/>
       </w:pPr>
       <w:r>
-        <w:t xml:space="preserve">A randomly drawn corpus cannot evaluate this system. Contradiction detection fires only when two papers report the same metric on the same dataset, and a relationship score can be judged only if the corpus holds both pairs that ought to rank highly and pairs that ought not. Thirty random papers supply almost no shared benchmarks and no negative control, against which a scorer calling every pair related would appear to do well.</w:t>
+        <w:t xml:space="preserve">A random sample cannot evaluate this system: contradictions need two papers that measure one quantity on one benchmark, and a ranking needs some pairs that should come out high and others low. We built the corpus as four clusters of real arXiv papers: A, eight convolutional image classifiers around residual networks [14]; B, eight pretrained language models around the Transformer [12] and BERT [13]; C, eight vision transformers and self-supervised methods including MoCo [15]; and D, six papers on retrieval, extraction and knowledge graphs [16, 17]. A pair is relevant when both papers share a cluster, giving 99 relevant pairs out of 435. A and D barely touch and are the negative control; A and C share ImageNet but not method. The relevance labels are ours, not independent judgements. A second, six-paper corpus has two planted contradictions, so that precision and recall can be computed for contradiction detection.</w:t>
       </w:r>
     </w:p>
     <w:p>
@@ -1040,358 +1031,1315 @@
         <w:pStyle w:val="Paragraph"/>
       </w:pPr>
       <w:r>
-        <w:t xml:space="preserve">We therefore built the corpus as four deliberate clusters of real arXiv papers, shown in Table 2. Cluster A is built around residual and convolutional architectures [14], cluster B around the Transformer [12] and the masked language models that followed it [13], and cluster D around retrieval and knowledge-graph work [16, 17]. Cluster membership is the ground truth: same-cluster papers address the same problem on overlapping benchmarks and should score as related, while cluster A against cluster D shares virtually nothing and serves as the negative control. Clusters A and C overlap on dataset but differ on method, testing whether the score separates "same benchmark" from "same approach". These papers cite one another densely and several report differing values for identical baselines.</w:t>
+        <w:t xml:space="preserve">We use P@k, the share of relevant pairs among the k highest-scoring, and R@k, the share of all relevant pairs found in the top k, on the global ranking of 435 pairs; ROC-AUC, the probability that a relevant pair outscores a non-relevant one; and, treating each paper as a query over the other 29, average precision (MAP is its mean) and nDCG@10 with binary gain. For contradictions, precision is TP / (TP + FP) and recall is TP / (TP + FN) at the level of document pairs, with F1 their harmonic mean; a planted pair with a confirmed finding is a true positive. Ties are broken at random and averaged, and a zero denominator is reported as n/a, not as a value. Intervals are 95% percentile bootstrap intervals over papers or pairs. The baselines are random ranking, TF-IDF over the full text [19], SBERT on the abstract [1], bibliographic similarity alone, each of methodology, dataset and results alone, and the full weighted score.</w:t>
+      </w:r>
+    </w:p>
+    <w:p>
+      <w:pPr>
+        <w:pStyle w:val="Heading1"/>
+      </w:pPr>
+      <w:r>
+        <w:t xml:space="preserve">RESULTS</w:t>
+      </w:r>
+    </w:p>
+    <w:p>
+      <w:pPr>
+        <w:pStyle w:val="Heading2"/>
+      </w:pPr>
+      <w:r>
+        <w:t xml:space="preserve">Segmentation</w:t>
+      </w:r>
+    </w:p>
+    <w:p>
+      <w:pPr>
+        <w:pStyle w:val="Paragraph"/>
+      </w:pPr>
+      <w:r>
+        <w:t xml:space="preserve">All thirty documents were segmented from detected headings and none fell back to page chunks. Recall was 215 of 240 expected sections (90%): perfect for introductions and reference lists, weakest for results at 21 of 30, because results are often folded into a section called Experiments.</w:t>
+      </w:r>
+    </w:p>
+    <w:p>
+      <w:pPr>
+        <w:pStyle w:val="Heading2"/>
+      </w:pPr>
+      <w:r>
+        <w:t xml:space="preserve">Relationship Ranking</w:t>
+      </w:r>
+    </w:p>
+    <w:p>
+      <w:pPr>
+        <w:pStyle w:val="Paragraph"/>
+      </w:pPr>
+      <w:r>
+        <w:t xml:space="preserve">Table 2 compares the proposed score with the baselines. The score is far above chance (P@10 0.80, MAP 0.68, nDCG@10 0.74, AUC 0.86, against 0.23, 0.31, 0.29 and 0.50) and better than each of its parts: the best single dimension, methodology, reaches an AUC of 0.80, and bibliographic similarity alone only 0.58. But full-text TF-IDF is better on every measure (P@10 1.00, MAP 0.78, nDCG@10 0.81, AUC 0.87). On AUC the two cannot be told apart, with the same interval (0.82 to 0.90); on MAP the intervals overlap (0.71 to 0.83 against 0.63 to 0.74). SBERT on abstracts matches our MAP (0.68) with a lower AUC (0.78). We therefore do not claim that the weighted score finds related papers better than simple text similarity.</w:t>
+      </w:r>
+    </w:p>
+    <w:p>
+      <w:pPr>
+        <w:pStyle w:val="TableCaption"/>
+      </w:pPr>
+      <w:r>
+        <w:rPr>
+          <w:b/>
+        </w:rPr>
+        <w:t xml:space="preserve">TABLE 2. </w:t>
+      </w:r>
+      <w:r>
+        <w:t xml:space="preserve">Ranking quality of the proposed score and seven baselines. P@k and AUC use the global ranking of 435 pairs; MAP and nDCG@10 use 30 per-paper queries. Random ranking is the mean of 500 trials.</w:t>
       </w:r>
     </w:p>
     <w:tbl>
       <w:tblPr>
-        <w:tblStyle w:val="TableGrid"/>
         <w:tblW w:w="9000" w:type="dxa"/>
-        <w:tblBorders>
-          <w:top w:val="single" w:sz="6" w:color="000000"/>
-          <w:bottom w:val="single" w:sz="6" w:color="000000"/>
-          <w:insideH w:val="single" w:sz="4" w:color="808080"/>
-        </w:tblBorders>
+        <w:jc w:val="center"/>
+        <w:tblLayout w:type="fixed"/>
+        <w:tblCellMar>
+          <w:left w:w="70" w:type="dxa"/>
+          <w:right w:w="70" w:type="dxa"/>
+        </w:tblCellMar>
+        <w:tblLook w:val="0000" w:firstRow="0" w:lastRow="0" w:firstColumn="0" w:lastColumn="0" w:noHBand="0" w:noVBand="0"/>
       </w:tblPr>
       <w:tblGrid>
-        <w:gridCol w:w="990"/>
-        <w:gridCol w:w="2700"/>
-        <w:gridCol w:w="630"/>
-        <w:gridCol w:w="4680"/>
+        <w:gridCol w:w="3060"/>
+        <w:gridCol w:w="900"/>
+        <w:gridCol w:w="900"/>
+        <w:gridCol w:w="900"/>
+        <w:gridCol w:w="900"/>
+        <w:gridCol w:w="1170"/>
+        <w:gridCol w:w="1170"/>
       </w:tblGrid>
       <w:tr>
         <w:trPr>
+          <w:cantSplit/>
           <w:tblHeader/>
         </w:trPr>
         <w:tc>
           <w:tcPr>
-            <w:tcW w:w="990" w:type="dxa"/>
-          </w:tcPr>
-          <w:p>
-            <w:pPr>
+            <w:tcW w:w="3060" w:type="dxa"/>
+            <w:tcBorders>
+              <w:top w:val="single" w:sz="4" w:space="0" w:color="000000"/>
+              <w:bottom w:val="single" w:sz="4" w:space="0" w:color="000000"/>
+            </w:tcBorders>
+          </w:tcPr>
+          <w:p>
+            <w:pPr>
+              <w:ind w:firstLine="0"/>
               <w:jc w:val="left"/>
             </w:pPr>
             <w:r>
               <w:rPr>
                 <w:b/>
                 <w:sz w:val="18"/>
-              </w:rPr>
-              <w:t xml:space="preserve">Cluster</w:t>
-            </w:r>
-          </w:p>
-        </w:tc>
-        <w:tc>
-          <w:tcPr>
-            <w:tcW w:w="2700" w:type="dxa"/>
-          </w:tcPr>
-          <w:p>
-            <w:pPr>
-              <w:jc w:val="left"/>
+                <w:szCs w:val="18"/>
+              </w:rPr>
+              <w:t xml:space="preserve">Method</w:t>
+            </w:r>
+          </w:p>
+        </w:tc>
+        <w:tc>
+          <w:tcPr>
+            <w:tcW w:w="900" w:type="dxa"/>
+            <w:tcBorders>
+              <w:top w:val="single" w:sz="4" w:space="0" w:color="000000"/>
+              <w:bottom w:val="single" w:sz="4" w:space="0" w:color="000000"/>
+            </w:tcBorders>
+          </w:tcPr>
+          <w:p>
+            <w:pPr>
+              <w:ind w:firstLine="0"/>
+              <w:jc w:val="center"/>
             </w:pPr>
             <w:r>
               <w:rPr>
                 <w:b/>
                 <w:sz w:val="18"/>
-              </w:rPr>
-              <w:t xml:space="preserve">Theme</w:t>
-            </w:r>
-          </w:p>
-        </w:tc>
-        <w:tc>
-          <w:tcPr>
-            <w:tcW w:w="630" w:type="dxa"/>
-          </w:tcPr>
-          <w:p>
-            <w:pPr>
-              <w:jc w:val="left"/>
+                <w:szCs w:val="18"/>
+              </w:rPr>
+              <w:t xml:space="preserve">P@10</w:t>
+            </w:r>
+          </w:p>
+        </w:tc>
+        <w:tc>
+          <w:tcPr>
+            <w:tcW w:w="900" w:type="dxa"/>
+            <w:tcBorders>
+              <w:top w:val="single" w:sz="4" w:space="0" w:color="000000"/>
+              <w:bottom w:val="single" w:sz="4" w:space="0" w:color="000000"/>
+            </w:tcBorders>
+          </w:tcPr>
+          <w:p>
+            <w:pPr>
+              <w:ind w:firstLine="0"/>
+              <w:jc w:val="center"/>
             </w:pPr>
             <w:r>
               <w:rPr>
                 <w:b/>
                 <w:sz w:val="18"/>
-              </w:rPr>
-              <w:t xml:space="preserve">n</w:t>
-            </w:r>
-          </w:p>
-        </w:tc>
-        <w:tc>
-          <w:tcPr>
-            <w:tcW w:w="4680" w:type="dxa"/>
-          </w:tcPr>
-          <w:p>
-            <w:pPr>
-              <w:jc w:val="left"/>
+                <w:szCs w:val="18"/>
+              </w:rPr>
+              <w:t xml:space="preserve">P@20</w:t>
+            </w:r>
+          </w:p>
+        </w:tc>
+        <w:tc>
+          <w:tcPr>
+            <w:tcW w:w="900" w:type="dxa"/>
+            <w:tcBorders>
+              <w:top w:val="single" w:sz="4" w:space="0" w:color="000000"/>
+              <w:bottom w:val="single" w:sz="4" w:space="0" w:color="000000"/>
+            </w:tcBorders>
+          </w:tcPr>
+          <w:p>
+            <w:pPr>
+              <w:ind w:firstLine="0"/>
+              <w:jc w:val="center"/>
             </w:pPr>
             <w:r>
               <w:rPr>
                 <w:b/>
                 <w:sz w:val="18"/>
-              </w:rPr>
-              <w:t xml:space="preserve">Role in the evaluation</w:t>
+                <w:szCs w:val="18"/>
+              </w:rPr>
+              <w:t xml:space="preserve">P@30</w:t>
+            </w:r>
+          </w:p>
+        </w:tc>
+        <w:tc>
+          <w:tcPr>
+            <w:tcW w:w="900" w:type="dxa"/>
+            <w:tcBorders>
+              <w:top w:val="single" w:sz="4" w:space="0" w:color="000000"/>
+              <w:bottom w:val="single" w:sz="4" w:space="0" w:color="000000"/>
+            </w:tcBorders>
+          </w:tcPr>
+          <w:p>
+            <w:pPr>
+              <w:ind w:firstLine="0"/>
+              <w:jc w:val="center"/>
+            </w:pPr>
+            <w:r>
+              <w:rPr>
+                <w:b/>
+                <w:sz w:val="18"/>
+                <w:szCs w:val="18"/>
+              </w:rPr>
+              <w:t xml:space="preserve">MAP</w:t>
+            </w:r>
+          </w:p>
+        </w:tc>
+        <w:tc>
+          <w:tcPr>
+            <w:tcW w:w="1170" w:type="dxa"/>
+            <w:tcBorders>
+              <w:top w:val="single" w:sz="4" w:space="0" w:color="000000"/>
+              <w:bottom w:val="single" w:sz="4" w:space="0" w:color="000000"/>
+            </w:tcBorders>
+          </w:tcPr>
+          <w:p>
+            <w:pPr>
+              <w:ind w:firstLine="0"/>
+              <w:jc w:val="center"/>
+            </w:pPr>
+            <w:r>
+              <w:rPr>
+                <w:b/>
+                <w:sz w:val="18"/>
+                <w:szCs w:val="18"/>
+              </w:rPr>
+              <w:t xml:space="preserve">nDCG@10</w:t>
+            </w:r>
+          </w:p>
+        </w:tc>
+        <w:tc>
+          <w:tcPr>
+            <w:tcW w:w="1170" w:type="dxa"/>
+            <w:tcBorders>
+              <w:top w:val="single" w:sz="4" w:space="0" w:color="000000"/>
+              <w:bottom w:val="single" w:sz="4" w:space="0" w:color="000000"/>
+            </w:tcBorders>
+          </w:tcPr>
+          <w:p>
+            <w:pPr>
+              <w:ind w:firstLine="0"/>
+              <w:jc w:val="center"/>
+            </w:pPr>
+            <w:r>
+              <w:rPr>
+                <w:b/>
+                <w:sz w:val="18"/>
+                <w:szCs w:val="18"/>
+              </w:rPr>
+              <w:t xml:space="preserve">AUC</w:t>
             </w:r>
           </w:p>
         </w:tc>
       </w:tr>
       <w:tr>
-        <w:tc>
-          <w:tcPr>
-            <w:tcW w:w="990" w:type="dxa"/>
-          </w:tcPr>
-          <w:p>
-            <w:pPr>
+        <w:trPr>
+          <w:cantSplit/>
+        </w:trPr>
+        <w:tc>
+          <w:tcPr>
+            <w:tcW w:w="3060" w:type="dxa"/>
+          </w:tcPr>
+          <w:p>
+            <w:pPr>
+              <w:ind w:firstLine="0"/>
               <w:jc w:val="left"/>
             </w:pPr>
             <w:r>
               <w:rPr>
-                <w:sz w:val="18"/>
-              </w:rPr>
-              <w:t xml:space="preserve">A</w:t>
-            </w:r>
-          </w:p>
-        </w:tc>
-        <w:tc>
-          <w:tcPr>
-            <w:tcW w:w="2700" w:type="dxa"/>
-          </w:tcPr>
-          <w:p>
-            <w:pPr>
-              <w:jc w:val="left"/>
-            </w:pPr>
-            <w:r>
-              <w:rPr>
-                <w:sz w:val="18"/>
-              </w:rPr>
-              <w:t xml:space="preserve">Convolutional image classification</w:t>
-            </w:r>
-          </w:p>
-        </w:tc>
-        <w:tc>
-          <w:tcPr>
-            <w:tcW w:w="630" w:type="dxa"/>
-          </w:tcPr>
-          <w:p>
-            <w:pPr>
-              <w:jc w:val="left"/>
-            </w:pPr>
-            <w:r>
-              <w:rPr>
-                <w:sz w:val="18"/>
-              </w:rPr>
-              <w:t xml:space="preserve">8</w:t>
-            </w:r>
-          </w:p>
-        </w:tc>
-        <w:tc>
-          <w:tcPr>
-            <w:tcW w:w="4680" w:type="dxa"/>
-          </w:tcPr>
-          <w:p>
-            <w:pPr>
-              <w:jc w:val="left"/>
-            </w:pPr>
-            <w:r>
-              <w:rPr>
-                <w:sz w:val="18"/>
-              </w:rPr>
-              <w:t xml:space="preserve">Dense cross-citation; same architectures reported with differing baselines</w:t>
+                <w:sz w:val="20"/>
+                <w:szCs w:val="20"/>
+              </w:rPr>
+              <w:t xml:space="preserve">Random ranking</w:t>
+            </w:r>
+          </w:p>
+        </w:tc>
+        <w:tc>
+          <w:tcPr>
+            <w:tcW w:w="900" w:type="dxa"/>
+          </w:tcPr>
+          <w:p>
+            <w:pPr>
+              <w:ind w:firstLine="0"/>
+              <w:jc w:val="center"/>
+            </w:pPr>
+            <w:r>
+              <w:rPr>
+                <w:sz w:val="20"/>
+                <w:szCs w:val="20"/>
+              </w:rPr>
+              <w:t xml:space="preserve">0.230</w:t>
+            </w:r>
+          </w:p>
+        </w:tc>
+        <w:tc>
+          <w:tcPr>
+            <w:tcW w:w="900" w:type="dxa"/>
+          </w:tcPr>
+          <w:p>
+            <w:pPr>
+              <w:ind w:firstLine="0"/>
+              <w:jc w:val="center"/>
+            </w:pPr>
+            <w:r>
+              <w:rPr>
+                <w:sz w:val="20"/>
+                <w:szCs w:val="20"/>
+              </w:rPr>
+              <w:t xml:space="preserve">0.232</w:t>
+            </w:r>
+          </w:p>
+        </w:tc>
+        <w:tc>
+          <w:tcPr>
+            <w:tcW w:w="900" w:type="dxa"/>
+          </w:tcPr>
+          <w:p>
+            <w:pPr>
+              <w:ind w:firstLine="0"/>
+              <w:jc w:val="center"/>
+            </w:pPr>
+            <w:r>
+              <w:rPr>
+                <w:sz w:val="20"/>
+                <w:szCs w:val="20"/>
+              </w:rPr>
+              <w:t xml:space="preserve">0.233</w:t>
+            </w:r>
+          </w:p>
+        </w:tc>
+        <w:tc>
+          <w:tcPr>
+            <w:tcW w:w="900" w:type="dxa"/>
+          </w:tcPr>
+          <w:p>
+            <w:pPr>
+              <w:ind w:firstLine="0"/>
+              <w:jc w:val="center"/>
+            </w:pPr>
+            <w:r>
+              <w:rPr>
+                <w:sz w:val="20"/>
+                <w:szCs w:val="20"/>
+              </w:rPr>
+              <w:t xml:space="preserve">0.310</w:t>
+            </w:r>
+          </w:p>
+        </w:tc>
+        <w:tc>
+          <w:tcPr>
+            <w:tcW w:w="1170" w:type="dxa"/>
+          </w:tcPr>
+          <w:p>
+            <w:pPr>
+              <w:ind w:firstLine="0"/>
+              <w:jc w:val="center"/>
+            </w:pPr>
+            <w:r>
+              <w:rPr>
+                <w:sz w:val="20"/>
+                <w:szCs w:val="20"/>
+              </w:rPr>
+              <w:t xml:space="preserve">0.295</w:t>
+            </w:r>
+          </w:p>
+        </w:tc>
+        <w:tc>
+          <w:tcPr>
+            <w:tcW w:w="1170" w:type="dxa"/>
+          </w:tcPr>
+          <w:p>
+            <w:pPr>
+              <w:ind w:firstLine="0"/>
+              <w:jc w:val="center"/>
+            </w:pPr>
+            <w:r>
+              <w:rPr>
+                <w:sz w:val="20"/>
+                <w:szCs w:val="20"/>
+              </w:rPr>
+              <w:t xml:space="preserve">0.501</w:t>
             </w:r>
           </w:p>
         </w:tc>
       </w:tr>
       <w:tr>
-        <w:tc>
-          <w:tcPr>
-            <w:tcW w:w="990" w:type="dxa"/>
-          </w:tcPr>
-          <w:p>
-            <w:pPr>
+        <w:trPr>
+          <w:cantSplit/>
+        </w:trPr>
+        <w:tc>
+          <w:tcPr>
+            <w:tcW w:w="3060" w:type="dxa"/>
+          </w:tcPr>
+          <w:p>
+            <w:pPr>
+              <w:ind w:firstLine="0"/>
               <w:jc w:val="left"/>
             </w:pPr>
             <w:r>
               <w:rPr>
-                <w:sz w:val="18"/>
-              </w:rPr>
-              <w:t xml:space="preserve">B</w:t>
-            </w:r>
-          </w:p>
-        </w:tc>
-        <w:tc>
-          <w:tcPr>
-            <w:tcW w:w="2700" w:type="dxa"/>
-          </w:tcPr>
-          <w:p>
-            <w:pPr>
-              <w:jc w:val="left"/>
-            </w:pPr>
-            <w:r>
-              <w:rPr>
-                <w:sz w:val="18"/>
-              </w:rPr>
-              <w:t xml:space="preserve">Pretrained language models</w:t>
-            </w:r>
-          </w:p>
-        </w:tc>
-        <w:tc>
-          <w:tcPr>
-            <w:tcW w:w="630" w:type="dxa"/>
-          </w:tcPr>
-          <w:p>
-            <w:pPr>
-              <w:jc w:val="left"/>
-            </w:pPr>
-            <w:r>
-              <w:rPr>
-                <w:sz w:val="18"/>
-              </w:rPr>
-              <w:t xml:space="preserve">8</w:t>
-            </w:r>
-          </w:p>
-        </w:tc>
-        <w:tc>
-          <w:tcPr>
-            <w:tcW w:w="4680" w:type="dxa"/>
-          </w:tcPr>
-          <w:p>
-            <w:pPr>
-              <w:jc w:val="left"/>
-            </w:pPr>
-            <w:r>
-              <w:rPr>
-                <w:sz w:val="18"/>
-              </w:rPr>
-              <w:t xml:space="preserve">Shared GLUE and SQuAD benchmarks</w:t>
+                <w:sz w:val="20"/>
+                <w:szCs w:val="20"/>
+              </w:rPr>
+              <w:t xml:space="preserve">TF-IDF (full text)</w:t>
+            </w:r>
+          </w:p>
+        </w:tc>
+        <w:tc>
+          <w:tcPr>
+            <w:tcW w:w="900" w:type="dxa"/>
+          </w:tcPr>
+          <w:p>
+            <w:pPr>
+              <w:ind w:firstLine="0"/>
+              <w:jc w:val="center"/>
+            </w:pPr>
+            <w:r>
+              <w:rPr>
+                <w:sz w:val="20"/>
+                <w:szCs w:val="20"/>
+              </w:rPr>
+              <w:t xml:space="preserve">1.000</w:t>
+            </w:r>
+          </w:p>
+        </w:tc>
+        <w:tc>
+          <w:tcPr>
+            <w:tcW w:w="900" w:type="dxa"/>
+          </w:tcPr>
+          <w:p>
+            <w:pPr>
+              <w:ind w:firstLine="0"/>
+              <w:jc w:val="center"/>
+            </w:pPr>
+            <w:r>
+              <w:rPr>
+                <w:sz w:val="20"/>
+                <w:szCs w:val="20"/>
+              </w:rPr>
+              <w:t xml:space="preserve">0.950</w:t>
+            </w:r>
+          </w:p>
+        </w:tc>
+        <w:tc>
+          <w:tcPr>
+            <w:tcW w:w="900" w:type="dxa"/>
+          </w:tcPr>
+          <w:p>
+            <w:pPr>
+              <w:ind w:firstLine="0"/>
+              <w:jc w:val="center"/>
+            </w:pPr>
+            <w:r>
+              <w:rPr>
+                <w:sz w:val="20"/>
+                <w:szCs w:val="20"/>
+              </w:rPr>
+              <w:t xml:space="preserve">0.967</w:t>
+            </w:r>
+          </w:p>
+        </w:tc>
+        <w:tc>
+          <w:tcPr>
+            <w:tcW w:w="900" w:type="dxa"/>
+          </w:tcPr>
+          <w:p>
+            <w:pPr>
+              <w:ind w:firstLine="0"/>
+              <w:jc w:val="center"/>
+            </w:pPr>
+            <w:r>
+              <w:rPr>
+                <w:sz w:val="20"/>
+                <w:szCs w:val="20"/>
+              </w:rPr>
+              <w:t xml:space="preserve">0.776</w:t>
+            </w:r>
+          </w:p>
+        </w:tc>
+        <w:tc>
+          <w:tcPr>
+            <w:tcW w:w="1170" w:type="dxa"/>
+          </w:tcPr>
+          <w:p>
+            <w:pPr>
+              <w:ind w:firstLine="0"/>
+              <w:jc w:val="center"/>
+            </w:pPr>
+            <w:r>
+              <w:rPr>
+                <w:sz w:val="20"/>
+                <w:szCs w:val="20"/>
+              </w:rPr>
+              <w:t xml:space="preserve">0.812</w:t>
+            </w:r>
+          </w:p>
+        </w:tc>
+        <w:tc>
+          <w:tcPr>
+            <w:tcW w:w="1170" w:type="dxa"/>
+          </w:tcPr>
+          <w:p>
+            <w:pPr>
+              <w:ind w:firstLine="0"/>
+              <w:jc w:val="center"/>
+            </w:pPr>
+            <w:r>
+              <w:rPr>
+                <w:sz w:val="20"/>
+                <w:szCs w:val="20"/>
+              </w:rPr>
+              <w:t xml:space="preserve">0.869</w:t>
             </w:r>
           </w:p>
         </w:tc>
       </w:tr>
       <w:tr>
-        <w:tc>
-          <w:tcPr>
-            <w:tcW w:w="990" w:type="dxa"/>
-          </w:tcPr>
-          <w:p>
-            <w:pPr>
+        <w:trPr>
+          <w:cantSplit/>
+        </w:trPr>
+        <w:tc>
+          <w:tcPr>
+            <w:tcW w:w="3060" w:type="dxa"/>
+          </w:tcPr>
+          <w:p>
+            <w:pPr>
+              <w:ind w:firstLine="0"/>
               <w:jc w:val="left"/>
             </w:pPr>
             <w:r>
               <w:rPr>
-                <w:sz w:val="18"/>
-              </w:rPr>
-              <w:t xml:space="preserve">C</w:t>
-            </w:r>
-          </w:p>
-        </w:tc>
-        <w:tc>
-          <w:tcPr>
-            <w:tcW w:w="2700" w:type="dxa"/>
-          </w:tcPr>
-          <w:p>
-            <w:pPr>
-              <w:jc w:val="left"/>
-            </w:pPr>
-            <w:r>
-              <w:rPr>
-                <w:sz w:val="18"/>
-              </w:rPr>
-              <w:t xml:space="preserve">Vision transformers and self-supervised vision</w:t>
-            </w:r>
-          </w:p>
-        </w:tc>
-        <w:tc>
-          <w:tcPr>
-            <w:tcW w:w="630" w:type="dxa"/>
-          </w:tcPr>
-          <w:p>
-            <w:pPr>
-              <w:jc w:val="left"/>
-            </w:pPr>
-            <w:r>
-              <w:rPr>
-                <w:sz w:val="18"/>
-              </w:rPr>
-              <w:t xml:space="preserve">8</w:t>
-            </w:r>
-          </w:p>
-        </w:tc>
-        <w:tc>
-          <w:tcPr>
-            <w:tcW w:w="4680" w:type="dxa"/>
-          </w:tcPr>
-          <w:p>
-            <w:pPr>
-              <w:jc w:val="left"/>
-            </w:pPr>
-            <w:r>
-              <w:rPr>
-                <w:sz w:val="18"/>
-              </w:rPr>
-              <w:t xml:space="preserve">Shares ImageNet with A but not method</w:t>
+                <w:sz w:val="20"/>
+                <w:szCs w:val="20"/>
+              </w:rPr>
+              <w:t xml:space="preserve">SBERT (abstract)</w:t>
+            </w:r>
+          </w:p>
+        </w:tc>
+        <w:tc>
+          <w:tcPr>
+            <w:tcW w:w="900" w:type="dxa"/>
+          </w:tcPr>
+          <w:p>
+            <w:pPr>
+              <w:ind w:firstLine="0"/>
+              <w:jc w:val="center"/>
+            </w:pPr>
+            <w:r>
+              <w:rPr>
+                <w:sz w:val="20"/>
+                <w:szCs w:val="20"/>
+              </w:rPr>
+              <w:t xml:space="preserve">1.000</w:t>
+            </w:r>
+          </w:p>
+        </w:tc>
+        <w:tc>
+          <w:tcPr>
+            <w:tcW w:w="900" w:type="dxa"/>
+          </w:tcPr>
+          <w:p>
+            <w:pPr>
+              <w:ind w:firstLine="0"/>
+              <w:jc w:val="center"/>
+            </w:pPr>
+            <w:r>
+              <w:rPr>
+                <w:sz w:val="20"/>
+                <w:szCs w:val="20"/>
+              </w:rPr>
+              <w:t xml:space="preserve">0.900</w:t>
+            </w:r>
+          </w:p>
+        </w:tc>
+        <w:tc>
+          <w:tcPr>
+            <w:tcW w:w="900" w:type="dxa"/>
+          </w:tcPr>
+          <w:p>
+            <w:pPr>
+              <w:ind w:firstLine="0"/>
+              <w:jc w:val="center"/>
+            </w:pPr>
+            <w:r>
+              <w:rPr>
+                <w:sz w:val="20"/>
+                <w:szCs w:val="20"/>
+              </w:rPr>
+              <w:t xml:space="preserve">0.800</w:t>
+            </w:r>
+          </w:p>
+        </w:tc>
+        <w:tc>
+          <w:tcPr>
+            <w:tcW w:w="900" w:type="dxa"/>
+          </w:tcPr>
+          <w:p>
+            <w:pPr>
+              <w:ind w:firstLine="0"/>
+              <w:jc w:val="center"/>
+            </w:pPr>
+            <w:r>
+              <w:rPr>
+                <w:sz w:val="20"/>
+                <w:szCs w:val="20"/>
+              </w:rPr>
+              <w:t xml:space="preserve">0.676</w:t>
+            </w:r>
+          </w:p>
+        </w:tc>
+        <w:tc>
+          <w:tcPr>
+            <w:tcW w:w="1170" w:type="dxa"/>
+          </w:tcPr>
+          <w:p>
+            <w:pPr>
+              <w:ind w:firstLine="0"/>
+              <w:jc w:val="center"/>
+            </w:pPr>
+            <w:r>
+              <w:rPr>
+                <w:sz w:val="20"/>
+                <w:szCs w:val="20"/>
+              </w:rPr>
+              <w:t xml:space="preserve">0.722</w:t>
+            </w:r>
+          </w:p>
+        </w:tc>
+        <w:tc>
+          <w:tcPr>
+            <w:tcW w:w="1170" w:type="dxa"/>
+          </w:tcPr>
+          <w:p>
+            <w:pPr>
+              <w:ind w:firstLine="0"/>
+              <w:jc w:val="center"/>
+            </w:pPr>
+            <w:r>
+              <w:rPr>
+                <w:sz w:val="20"/>
+                <w:szCs w:val="20"/>
+              </w:rPr>
+              <w:t xml:space="preserve">0.780</w:t>
             </w:r>
           </w:p>
         </w:tc>
       </w:tr>
       <w:tr>
-        <w:tc>
-          <w:tcPr>
-            <w:tcW w:w="990" w:type="dxa"/>
-          </w:tcPr>
-          <w:p>
-            <w:pPr>
+        <w:trPr>
+          <w:cantSplit/>
+        </w:trPr>
+        <w:tc>
+          <w:tcPr>
+            <w:tcW w:w="3060" w:type="dxa"/>
+          </w:tcPr>
+          <w:p>
+            <w:pPr>
+              <w:ind w:firstLine="0"/>
               <w:jc w:val="left"/>
             </w:pPr>
             <w:r>
               <w:rPr>
-                <w:sz w:val="18"/>
-              </w:rPr>
-              <w:t xml:space="preserve">D</w:t>
-            </w:r>
-          </w:p>
-        </w:tc>
-        <w:tc>
-          <w:tcPr>
-            <w:tcW w:w="2700" w:type="dxa"/>
-          </w:tcPr>
-          <w:p>
-            <w:pPr>
+                <w:sz w:val="20"/>
+                <w:szCs w:val="20"/>
+              </w:rPr>
+              <w:t xml:space="preserve">Bibliographic similarity</w:t>
+            </w:r>
+          </w:p>
+        </w:tc>
+        <w:tc>
+          <w:tcPr>
+            <w:tcW w:w="900" w:type="dxa"/>
+          </w:tcPr>
+          <w:p>
+            <w:pPr>
+              <w:ind w:firstLine="0"/>
+              <w:jc w:val="center"/>
+            </w:pPr>
+            <w:r>
+              <w:rPr>
+                <w:sz w:val="20"/>
+                <w:szCs w:val="20"/>
+              </w:rPr>
+              <w:t xml:space="preserve">0.700</w:t>
+            </w:r>
+          </w:p>
+        </w:tc>
+        <w:tc>
+          <w:tcPr>
+            <w:tcW w:w="900" w:type="dxa"/>
+          </w:tcPr>
+          <w:p>
+            <w:pPr>
+              <w:ind w:firstLine="0"/>
+              <w:jc w:val="center"/>
+            </w:pPr>
+            <w:r>
+              <w:rPr>
+                <w:sz w:val="20"/>
+                <w:szCs w:val="20"/>
+              </w:rPr>
+              <w:t xml:space="preserve">0.700</w:t>
+            </w:r>
+          </w:p>
+        </w:tc>
+        <w:tc>
+          <w:tcPr>
+            <w:tcW w:w="900" w:type="dxa"/>
+          </w:tcPr>
+          <w:p>
+            <w:pPr>
+              <w:ind w:firstLine="0"/>
+              <w:jc w:val="center"/>
+            </w:pPr>
+            <w:r>
+              <w:rPr>
+                <w:sz w:val="20"/>
+                <w:szCs w:val="20"/>
+              </w:rPr>
+              <w:t xml:space="preserve">0.600</w:t>
+            </w:r>
+          </w:p>
+        </w:tc>
+        <w:tc>
+          <w:tcPr>
+            <w:tcW w:w="900" w:type="dxa"/>
+          </w:tcPr>
+          <w:p>
+            <w:pPr>
+              <w:ind w:firstLine="0"/>
+              <w:jc w:val="center"/>
+            </w:pPr>
+            <w:r>
+              <w:rPr>
+                <w:sz w:val="20"/>
+                <w:szCs w:val="20"/>
+              </w:rPr>
+              <w:t xml:space="preserve">0.416</w:t>
+            </w:r>
+          </w:p>
+        </w:tc>
+        <w:tc>
+          <w:tcPr>
+            <w:tcW w:w="1170" w:type="dxa"/>
+          </w:tcPr>
+          <w:p>
+            <w:pPr>
+              <w:ind w:firstLine="0"/>
+              <w:jc w:val="center"/>
+            </w:pPr>
+            <w:r>
+              <w:rPr>
+                <w:sz w:val="20"/>
+                <w:szCs w:val="20"/>
+              </w:rPr>
+              <w:t xml:space="preserve">0.422</w:t>
+            </w:r>
+          </w:p>
+        </w:tc>
+        <w:tc>
+          <w:tcPr>
+            <w:tcW w:w="1170" w:type="dxa"/>
+          </w:tcPr>
+          <w:p>
+            <w:pPr>
+              <w:ind w:firstLine="0"/>
+              <w:jc w:val="center"/>
+            </w:pPr>
+            <w:r>
+              <w:rPr>
+                <w:sz w:val="20"/>
+                <w:szCs w:val="20"/>
+              </w:rPr>
+              <w:t xml:space="preserve">0.579</w:t>
+            </w:r>
+          </w:p>
+        </w:tc>
+      </w:tr>
+      <w:tr>
+        <w:trPr>
+          <w:cantSplit/>
+        </w:trPr>
+        <w:tc>
+          <w:tcPr>
+            <w:tcW w:w="3060" w:type="dxa"/>
+          </w:tcPr>
+          <w:p>
+            <w:pPr>
+              <w:ind w:firstLine="0"/>
               <w:jc w:val="left"/>
             </w:pPr>
             <w:r>
               <w:rPr>
-                <w:sz w:val="18"/>
-              </w:rPr>
-              <w:t xml:space="preserve">Retrieval, information extraction, knowledge graphs</w:t>
-            </w:r>
-          </w:p>
-        </w:tc>
-        <w:tc>
-          <w:tcPr>
-            <w:tcW w:w="630" w:type="dxa"/>
-          </w:tcPr>
-          <w:p>
-            <w:pPr>
+                <w:sz w:val="20"/>
+                <w:szCs w:val="20"/>
+              </w:rPr>
+              <w:t xml:space="preserve">Methodology only</w:t>
+            </w:r>
+          </w:p>
+        </w:tc>
+        <w:tc>
+          <w:tcPr>
+            <w:tcW w:w="900" w:type="dxa"/>
+          </w:tcPr>
+          <w:p>
+            <w:pPr>
+              <w:ind w:firstLine="0"/>
+              <w:jc w:val="center"/>
+            </w:pPr>
+            <w:r>
+              <w:rPr>
+                <w:sz w:val="20"/>
+                <w:szCs w:val="20"/>
+              </w:rPr>
+              <w:t xml:space="preserve">0.600</w:t>
+            </w:r>
+          </w:p>
+        </w:tc>
+        <w:tc>
+          <w:tcPr>
+            <w:tcW w:w="900" w:type="dxa"/>
+          </w:tcPr>
+          <w:p>
+            <w:pPr>
+              <w:ind w:firstLine="0"/>
+              <w:jc w:val="center"/>
+            </w:pPr>
+            <w:r>
+              <w:rPr>
+                <w:sz w:val="20"/>
+                <w:szCs w:val="20"/>
+              </w:rPr>
+              <w:t xml:space="preserve">0.750</w:t>
+            </w:r>
+          </w:p>
+        </w:tc>
+        <w:tc>
+          <w:tcPr>
+            <w:tcW w:w="900" w:type="dxa"/>
+          </w:tcPr>
+          <w:p>
+            <w:pPr>
+              <w:ind w:firstLine="0"/>
+              <w:jc w:val="center"/>
+            </w:pPr>
+            <w:r>
+              <w:rPr>
+                <w:sz w:val="20"/>
+                <w:szCs w:val="20"/>
+              </w:rPr>
+              <w:t xml:space="preserve">0.733</w:t>
+            </w:r>
+          </w:p>
+        </w:tc>
+        <w:tc>
+          <w:tcPr>
+            <w:tcW w:w="900" w:type="dxa"/>
+          </w:tcPr>
+          <w:p>
+            <w:pPr>
+              <w:ind w:firstLine="0"/>
+              <w:jc w:val="center"/>
+            </w:pPr>
+            <w:r>
+              <w:rPr>
+                <w:sz w:val="20"/>
+                <w:szCs w:val="20"/>
+              </w:rPr>
+              <w:t xml:space="preserve">0.650</w:t>
+            </w:r>
+          </w:p>
+        </w:tc>
+        <w:tc>
+          <w:tcPr>
+            <w:tcW w:w="1170" w:type="dxa"/>
+          </w:tcPr>
+          <w:p>
+            <w:pPr>
+              <w:ind w:firstLine="0"/>
+              <w:jc w:val="center"/>
+            </w:pPr>
+            <w:r>
+              <w:rPr>
+                <w:sz w:val="20"/>
+                <w:szCs w:val="20"/>
+              </w:rPr>
+              <w:t xml:space="preserve">0.704</w:t>
+            </w:r>
+          </w:p>
+        </w:tc>
+        <w:tc>
+          <w:tcPr>
+            <w:tcW w:w="1170" w:type="dxa"/>
+          </w:tcPr>
+          <w:p>
+            <w:pPr>
+              <w:ind w:firstLine="0"/>
+              <w:jc w:val="center"/>
+            </w:pPr>
+            <w:r>
+              <w:rPr>
+                <w:sz w:val="20"/>
+                <w:szCs w:val="20"/>
+              </w:rPr>
+              <w:t xml:space="preserve">0.803</w:t>
+            </w:r>
+          </w:p>
+        </w:tc>
+      </w:tr>
+      <w:tr>
+        <w:trPr>
+          <w:cantSplit/>
+        </w:trPr>
+        <w:tc>
+          <w:tcPr>
+            <w:tcW w:w="3060" w:type="dxa"/>
+          </w:tcPr>
+          <w:p>
+            <w:pPr>
+              <w:ind w:firstLine="0"/>
               <w:jc w:val="left"/>
             </w:pPr>
             <w:r>
               <w:rPr>
-                <w:sz w:val="18"/>
-              </w:rPr>
-              <w:t xml:space="preserve">6</w:t>
-            </w:r>
-          </w:p>
-        </w:tc>
-        <w:tc>
-          <w:tcPr>
-            <w:tcW w:w="4680" w:type="dxa"/>
-          </w:tcPr>
-          <w:p>
-            <w:pPr>
+                <w:sz w:val="20"/>
+                <w:szCs w:val="20"/>
+              </w:rPr>
+              <w:t xml:space="preserve">Dataset only</w:t>
+            </w:r>
+          </w:p>
+        </w:tc>
+        <w:tc>
+          <w:tcPr>
+            <w:tcW w:w="900" w:type="dxa"/>
+          </w:tcPr>
+          <w:p>
+            <w:pPr>
+              <w:ind w:firstLine="0"/>
+              <w:jc w:val="center"/>
+            </w:pPr>
+            <w:r>
+              <w:rPr>
+                <w:sz w:val="20"/>
+                <w:szCs w:val="20"/>
+              </w:rPr>
+              <w:t xml:space="preserve">0.733</w:t>
+            </w:r>
+          </w:p>
+        </w:tc>
+        <w:tc>
+          <w:tcPr>
+            <w:tcW w:w="900" w:type="dxa"/>
+          </w:tcPr>
+          <w:p>
+            <w:pPr>
+              <w:ind w:firstLine="0"/>
+              <w:jc w:val="center"/>
+            </w:pPr>
+            <w:r>
+              <w:rPr>
+                <w:sz w:val="20"/>
+                <w:szCs w:val="20"/>
+              </w:rPr>
+              <w:t xml:space="preserve">0.563</w:t>
+            </w:r>
+          </w:p>
+        </w:tc>
+        <w:tc>
+          <w:tcPr>
+            <w:tcW w:w="900" w:type="dxa"/>
+          </w:tcPr>
+          <w:p>
+            <w:pPr>
+              <w:ind w:firstLine="0"/>
+              <w:jc w:val="center"/>
+            </w:pPr>
+            <w:r>
+              <w:rPr>
+                <w:sz w:val="20"/>
+                <w:szCs w:val="20"/>
+              </w:rPr>
+              <w:t xml:space="preserve">0.528</w:t>
+            </w:r>
+          </w:p>
+        </w:tc>
+        <w:tc>
+          <w:tcPr>
+            <w:tcW w:w="900" w:type="dxa"/>
+          </w:tcPr>
+          <w:p>
+            <w:pPr>
+              <w:ind w:firstLine="0"/>
+              <w:jc w:val="center"/>
+            </w:pPr>
+            <w:r>
+              <w:rPr>
+                <w:sz w:val="20"/>
+                <w:szCs w:val="20"/>
+              </w:rPr>
+              <w:t xml:space="preserve">0.582</w:t>
+            </w:r>
+          </w:p>
+        </w:tc>
+        <w:tc>
+          <w:tcPr>
+            <w:tcW w:w="1170" w:type="dxa"/>
+          </w:tcPr>
+          <w:p>
+            <w:pPr>
+              <w:ind w:firstLine="0"/>
+              <w:jc w:val="center"/>
+            </w:pPr>
+            <w:r>
+              <w:rPr>
+                <w:sz w:val="20"/>
+                <w:szCs w:val="20"/>
+              </w:rPr>
+              <w:t xml:space="preserve">0.604</w:t>
+            </w:r>
+          </w:p>
+        </w:tc>
+        <w:tc>
+          <w:tcPr>
+            <w:tcW w:w="1170" w:type="dxa"/>
+          </w:tcPr>
+          <w:p>
+            <w:pPr>
+              <w:ind w:firstLine="0"/>
+              <w:jc w:val="center"/>
+            </w:pPr>
+            <w:r>
+              <w:rPr>
+                <w:sz w:val="20"/>
+                <w:szCs w:val="20"/>
+              </w:rPr>
+              <w:t xml:space="preserve">0.790</w:t>
+            </w:r>
+          </w:p>
+        </w:tc>
+      </w:tr>
+      <w:tr>
+        <w:trPr>
+          <w:cantSplit/>
+        </w:trPr>
+        <w:tc>
+          <w:tcPr>
+            <w:tcW w:w="3060" w:type="dxa"/>
+          </w:tcPr>
+          <w:p>
+            <w:pPr>
+              <w:ind w:firstLine="0"/>
               <w:jc w:val="left"/>
             </w:pPr>
             <w:r>
               <w:rPr>
-                <w:sz w:val="18"/>
-              </w:rPr>
-              <w:t xml:space="preserve">Negative control against cluster A</w:t>
+                <w:sz w:val="20"/>
+                <w:szCs w:val="20"/>
+              </w:rPr>
+              <w:t xml:space="preserve">Results/metrics only</w:t>
+            </w:r>
+          </w:p>
+        </w:tc>
+        <w:tc>
+          <w:tcPr>
+            <w:tcW w:w="900" w:type="dxa"/>
+          </w:tcPr>
+          <w:p>
+            <w:pPr>
+              <w:ind w:firstLine="0"/>
+              <w:jc w:val="center"/>
+            </w:pPr>
+            <w:r>
+              <w:rPr>
+                <w:sz w:val="20"/>
+                <w:szCs w:val="20"/>
+              </w:rPr>
+              <w:t xml:space="preserve">0.500</w:t>
+            </w:r>
+          </w:p>
+        </w:tc>
+        <w:tc>
+          <w:tcPr>
+            <w:tcW w:w="900" w:type="dxa"/>
+          </w:tcPr>
+          <w:p>
+            <w:pPr>
+              <w:ind w:firstLine="0"/>
+              <w:jc w:val="center"/>
+            </w:pPr>
+            <w:r>
+              <w:rPr>
+                <w:sz w:val="20"/>
+                <w:szCs w:val="20"/>
+              </w:rPr>
+              <w:t xml:space="preserve">0.550</w:t>
+            </w:r>
+          </w:p>
+        </w:tc>
+        <w:tc>
+          <w:tcPr>
+            <w:tcW w:w="900" w:type="dxa"/>
+          </w:tcPr>
+          <w:p>
+            <w:pPr>
+              <w:ind w:firstLine="0"/>
+              <w:jc w:val="center"/>
+            </w:pPr>
+            <w:r>
+              <w:rPr>
+                <w:sz w:val="20"/>
+                <w:szCs w:val="20"/>
+              </w:rPr>
+              <w:t xml:space="preserve">0.633</w:t>
+            </w:r>
+          </w:p>
+        </w:tc>
+        <w:tc>
+          <w:tcPr>
+            <w:tcW w:w="900" w:type="dxa"/>
+          </w:tcPr>
+          <w:p>
+            <w:pPr>
+              <w:ind w:firstLine="0"/>
+              <w:jc w:val="center"/>
+            </w:pPr>
+            <w:r>
+              <w:rPr>
+                <w:sz w:val="20"/>
+                <w:szCs w:val="20"/>
+              </w:rPr>
+              <w:t xml:space="preserve">0.617</w:t>
+            </w:r>
+          </w:p>
+        </w:tc>
+        <w:tc>
+          <w:tcPr>
+            <w:tcW w:w="1170" w:type="dxa"/>
+          </w:tcPr>
+          <w:p>
+            <w:pPr>
+              <w:ind w:firstLine="0"/>
+              <w:jc w:val="center"/>
+            </w:pPr>
+            <w:r>
+              <w:rPr>
+                <w:sz w:val="20"/>
+                <w:szCs w:val="20"/>
+              </w:rPr>
+              <w:t xml:space="preserve">0.667</w:t>
+            </w:r>
+          </w:p>
+        </w:tc>
+        <w:tc>
+          <w:tcPr>
+            <w:tcW w:w="1170" w:type="dxa"/>
+          </w:tcPr>
+          <w:p>
+            <w:pPr>
+              <w:ind w:firstLine="0"/>
+              <w:jc w:val="center"/>
+            </w:pPr>
+            <w:r>
+              <w:rPr>
+                <w:sz w:val="20"/>
+                <w:szCs w:val="20"/>
+              </w:rPr>
+              <w:t xml:space="preserve">0.788</w:t>
+            </w:r>
+          </w:p>
+        </w:tc>
+      </w:tr>
+      <w:tr>
+        <w:trPr>
+          <w:cantSplit/>
+        </w:trPr>
+        <w:tc>
+          <w:tcPr>
+            <w:tcW w:w="3060" w:type="dxa"/>
+            <w:tcBorders>
+              <w:bottom w:val="single" w:sz="4" w:space="0" w:color="000000"/>
+            </w:tcBorders>
+          </w:tcPr>
+          <w:p>
+            <w:pPr>
+              <w:ind w:firstLine="0"/>
+              <w:jc w:val="left"/>
+            </w:pPr>
+            <w:r>
+              <w:rPr>
+                <w:sz w:val="20"/>
+                <w:szCs w:val="20"/>
+              </w:rPr>
+              <w:t xml:space="preserve">Full weighted score (ours)</w:t>
+            </w:r>
+          </w:p>
+        </w:tc>
+        <w:tc>
+          <w:tcPr>
+            <w:tcW w:w="900" w:type="dxa"/>
+            <w:tcBorders>
+              <w:bottom w:val="single" w:sz="4" w:space="0" w:color="000000"/>
+            </w:tcBorders>
+          </w:tcPr>
+          <w:p>
+            <w:pPr>
+              <w:ind w:firstLine="0"/>
+              <w:jc w:val="center"/>
+            </w:pPr>
+            <w:r>
+              <w:rPr>
+                <w:sz w:val="20"/>
+                <w:szCs w:val="20"/>
+              </w:rPr>
+              <w:t xml:space="preserve">0.800</w:t>
+            </w:r>
+          </w:p>
+        </w:tc>
+        <w:tc>
+          <w:tcPr>
+            <w:tcW w:w="900" w:type="dxa"/>
+            <w:tcBorders>
+              <w:bottom w:val="single" w:sz="4" w:space="0" w:color="000000"/>
+            </w:tcBorders>
+          </w:tcPr>
+          <w:p>
+            <w:pPr>
+              <w:ind w:firstLine="0"/>
+              <w:jc w:val="center"/>
+            </w:pPr>
+            <w:r>
+              <w:rPr>
+                <w:sz w:val="20"/>
+                <w:szCs w:val="20"/>
+              </w:rPr>
+              <w:t xml:space="preserve">0.850</w:t>
+            </w:r>
+          </w:p>
+        </w:tc>
+        <w:tc>
+          <w:tcPr>
+            <w:tcW w:w="900" w:type="dxa"/>
+            <w:tcBorders>
+              <w:bottom w:val="single" w:sz="4" w:space="0" w:color="000000"/>
+            </w:tcBorders>
+          </w:tcPr>
+          <w:p>
+            <w:pPr>
+              <w:ind w:firstLine="0"/>
+              <w:jc w:val="center"/>
+            </w:pPr>
+            <w:r>
+              <w:rPr>
+                <w:sz w:val="20"/>
+                <w:szCs w:val="20"/>
+              </w:rPr>
+              <w:t xml:space="preserve">0.767</w:t>
+            </w:r>
+          </w:p>
+        </w:tc>
+        <w:tc>
+          <w:tcPr>
+            <w:tcW w:w="900" w:type="dxa"/>
+            <w:tcBorders>
+              <w:bottom w:val="single" w:sz="4" w:space="0" w:color="000000"/>
+            </w:tcBorders>
+          </w:tcPr>
+          <w:p>
+            <w:pPr>
+              <w:ind w:firstLine="0"/>
+              <w:jc w:val="center"/>
+            </w:pPr>
+            <w:r>
+              <w:rPr>
+                <w:sz w:val="20"/>
+                <w:szCs w:val="20"/>
+              </w:rPr>
+              <w:t xml:space="preserve">0.682</w:t>
+            </w:r>
+          </w:p>
+        </w:tc>
+        <w:tc>
+          <w:tcPr>
+            <w:tcW w:w="1170" w:type="dxa"/>
+            <w:tcBorders>
+              <w:bottom w:val="single" w:sz="4" w:space="0" w:color="000000"/>
+            </w:tcBorders>
+          </w:tcPr>
+          <w:p>
+            <w:pPr>
+              <w:ind w:firstLine="0"/>
+              <w:jc w:val="center"/>
+            </w:pPr>
+            <w:r>
+              <w:rPr>
+                <w:sz w:val="20"/>
+                <w:szCs w:val="20"/>
+              </w:rPr>
+              <w:t xml:space="preserve">0.737</w:t>
+            </w:r>
+          </w:p>
+        </w:tc>
+        <w:tc>
+          <w:tcPr>
+            <w:tcW w:w="1170" w:type="dxa"/>
+            <w:tcBorders>
+              <w:bottom w:val="single" w:sz="4" w:space="0" w:color="000000"/>
+            </w:tcBorders>
+          </w:tcPr>
+          <w:p>
+            <w:pPr>
+              <w:ind w:firstLine="0"/>
+              <w:jc w:val="center"/>
+            </w:pPr>
+            <w:r>
+              <w:rPr>
+                <w:sz w:val="20"/>
+                <w:szCs w:val="20"/>
+              </w:rPr>
+              <w:t xml:space="preserve">0.860</w:t>
             </w:r>
           </w:p>
         </w:tc>
@@ -1400,431 +2348,10 @@
     <w:p/>
     <w:p>
       <w:pPr>
-        <w:pStyle w:val="TableCaption"/>
-      </w:pPr>
-      <w:r>
-        <w:t xml:space="preserve">Table 2. The evaluation corpus. Cluster membership is the ground truth for relationship ranking.</w:t>
-      </w:r>
-    </w:p>
-    <w:p>
-      <w:pPr>
-        <w:pStyle w:val="Heading1"/>
-      </w:pPr>
-      <w:r>
-        <w:t xml:space="preserve">RESULTS</w:t>
-      </w:r>
-    </w:p>
-    <w:p>
-      <w:pPr>
-        <w:pStyle w:val="Heading2"/>
-      </w:pPr>
-      <w:r>
-        <w:t xml:space="preserve">Segmentation</w:t>
-      </w:r>
-    </w:p>
-    <w:p>
-      <w:pPr>
         <w:pStyle w:val="Paragraph"/>
       </w:pPr>
       <w:r>
-        <w:t xml:space="preserve">All thirty documents were segmented using detected headings, with none falling back to page chunking. Across the eight expected section types, 215 of 240 were recovered, a recall of 90%; Figure 3 shows the view in which this is inspected per paper. Recovery was perfect for introductions and reference lists and weakest for results sections at 21 of 30, which is unsurprising: results are frequently folded into a section headed Experiments, or distributed across several subsections with names like Ablations and Comparison that our patterns map elsewhere.</w:t>
-      </w:r>
-    </w:p>
-    <w:p>
-      <w:pPr>
-        <w:jc w:val="center"/>
-      </w:pPr>
-      <w:r>
-        <w:drawing>
-          <wp:inline distT="0" distB="0" distL="0" distR="0">
-            <wp:extent cx="4754880" cy="1680604"/>
-            <wp:effectExtent l="0" t="0" r="0" b="0"/>
-            <wp:docPr id="9070" name="fig3_documents.png"/>
-            <wp:cNvGraphicFramePr>
-              <a:graphicFrameLocks xmlns:a="http://schemas.openxmlformats.org/drawingml/2006/main" noChangeAspect="1"/>
-            </wp:cNvGraphicFramePr>
-            <a:graphic xmlns:a="http://schemas.openxmlformats.org/drawingml/2006/main">
-              <a:graphicData uri="http://schemas.openxmlformats.org/drawingml/2006/picture">
-                <pic:pic xmlns:pic="http://schemas.openxmlformats.org/drawingml/2006/picture">
-                  <pic:nvPicPr>
-                    <pic:cNvPr id="0" name="fig3_documents.png"/>
-                    <pic:cNvPicPr/>
-                  </pic:nvPicPr>
-                  <pic:blipFill>
-                    <a:blip r:embed="rIdFig3"/>
-                    <a:stretch>
-                      <a:fillRect/>
-                    </a:stretch>
-                  </pic:blipFill>
-                  <pic:spPr>
-                    <a:xfrm>
-                      <a:off x="0" y="0"/>
-                      <a:ext cx="4754880" cy="1680604"/>
-                    </a:xfrm>
-                    <a:prstGeom prst="rect">
-                      <a:avLst/>
-                    </a:prstGeom>
-                  </pic:spPr>
-                </pic:pic>
-              </a:graphicData>
-            </a:graphic>
-          </wp:inline>
-        </w:drawing>
-      </w:r>
-    </w:p>
-    <w:p>
-      <w:pPr>
-        <w:pStyle w:val="FigureCaption"/>
-      </w:pPr>
-      <w:r>
-        <w:t xml:space="preserve">FIGURE 3. The per-document view, where segmentation becomes visible: for each paper the assigned category and its confidence, the page count, the sections actually recovered, and the number of references parsed.</w:t>
-      </w:r>
-    </w:p>
-    <w:p>
-      <w:pPr>
-        <w:pStyle w:val="Heading2"/>
-      </w:pPr>
-      <w:r>
-        <w:t xml:space="preserve">Relationship ranking</w:t>
-      </w:r>
-    </w:p>
-    <w:p>
-      <w:pPr>
-        <w:pStyle w:val="Paragraph"/>
-      </w:pPr>
-      <w:r>
-        <w:t xml:space="preserve">Of the 435 scored pairs, 99 fall within a cluster and 336 across clusters, so a system ranking pairs at random would be correct 23% of the time. Table 3 reports precision at several cut-offs, and Figure 4 shows the full score matrix ordered by cluster, in which the within-cluster blocks and the pale cluster A against cluster D region are both visible directly.</w:t>
-      </w:r>
-    </w:p>
-    <w:tbl>
-      <w:tblPr>
-        <w:tblStyle w:val="TableGrid"/>
-        <w:tblW w:w="9000" w:type="dxa"/>
-        <w:tblBorders>
-          <w:top w:val="single" w:sz="6" w:color="000000"/>
-          <w:bottom w:val="single" w:sz="6" w:color="000000"/>
-          <w:insideH w:val="single" w:sz="4" w:color="808080"/>
-        </w:tblBorders>
-      </w:tblPr>
-      <w:tblGrid>
-        <w:gridCol w:w="2700"/>
-        <w:gridCol w:w="2250"/>
-        <w:gridCol w:w="4050"/>
-      </w:tblGrid>
-      <w:tr>
-        <w:trPr>
-          <w:tblHeader/>
-        </w:trPr>
-        <w:tc>
-          <w:tcPr>
-            <w:tcW w:w="2700" w:type="dxa"/>
-          </w:tcPr>
-          <w:p>
-            <w:pPr>
-              <w:jc w:val="left"/>
-            </w:pPr>
-            <w:r>
-              <w:rPr>
-                <w:b/>
-                <w:sz w:val="18"/>
-              </w:rPr>
-              <w:t xml:space="preserve">Cut-off</w:t>
-            </w:r>
-          </w:p>
-        </w:tc>
-        <w:tc>
-          <w:tcPr>
-            <w:tcW w:w="2250" w:type="dxa"/>
-          </w:tcPr>
-          <w:p>
-            <w:pPr>
-              <w:jc w:val="left"/>
-            </w:pPr>
-            <w:r>
-              <w:rPr>
-                <w:b/>
-                <w:sz w:val="18"/>
-              </w:rPr>
-              <w:t xml:space="preserve">Correct</w:t>
-            </w:r>
-          </w:p>
-        </w:tc>
-        <w:tc>
-          <w:tcPr>
-            <w:tcW w:w="4050" w:type="dxa"/>
-          </w:tcPr>
-          <w:p>
-            <w:pPr>
-              <w:jc w:val="left"/>
-            </w:pPr>
-            <w:r>
-              <w:rPr>
-                <w:b/>
-                <w:sz w:val="18"/>
-              </w:rPr>
-              <w:t xml:space="preserve">Precision</w:t>
-            </w:r>
-          </w:p>
-        </w:tc>
-      </w:tr>
-      <w:tr>
-        <w:tc>
-          <w:tcPr>
-            <w:tcW w:w="2700" w:type="dxa"/>
-          </w:tcPr>
-          <w:p>
-            <w:pPr>
-              <w:jc w:val="left"/>
-            </w:pPr>
-            <w:r>
-              <w:rPr>
-                <w:sz w:val="18"/>
-              </w:rPr>
-              <w:t xml:space="preserve">precision@5</w:t>
-            </w:r>
-          </w:p>
-        </w:tc>
-        <w:tc>
-          <w:tcPr>
-            <w:tcW w:w="2250" w:type="dxa"/>
-          </w:tcPr>
-          <w:p>
-            <w:pPr>
-              <w:jc w:val="left"/>
-            </w:pPr>
-            <w:r>
-              <w:rPr>
-                <w:sz w:val="18"/>
-              </w:rPr>
-              <w:t xml:space="preserve">3 / 5</w:t>
-            </w:r>
-          </w:p>
-        </w:tc>
-        <w:tc>
-          <w:tcPr>
-            <w:tcW w:w="4050" w:type="dxa"/>
-          </w:tcPr>
-          <w:p>
-            <w:pPr>
-              <w:jc w:val="left"/>
-            </w:pPr>
-            <w:r>
-              <w:rPr>
-                <w:sz w:val="18"/>
-              </w:rPr>
-              <w:t xml:space="preserve">60%</w:t>
-            </w:r>
-          </w:p>
-        </w:tc>
-      </w:tr>
-      <w:tr>
-        <w:tc>
-          <w:tcPr>
-            <w:tcW w:w="2700" w:type="dxa"/>
-          </w:tcPr>
-          <w:p>
-            <w:pPr>
-              <w:jc w:val="left"/>
-            </w:pPr>
-            <w:r>
-              <w:rPr>
-                <w:sz w:val="18"/>
-              </w:rPr>
-              <w:t xml:space="preserve">precision@10</w:t>
-            </w:r>
-          </w:p>
-        </w:tc>
-        <w:tc>
-          <w:tcPr>
-            <w:tcW w:w="2250" w:type="dxa"/>
-          </w:tcPr>
-          <w:p>
-            <w:pPr>
-              <w:jc w:val="left"/>
-            </w:pPr>
-            <w:r>
-              <w:rPr>
-                <w:sz w:val="18"/>
-              </w:rPr>
-              <w:t xml:space="preserve">8 / 10</w:t>
-            </w:r>
-          </w:p>
-        </w:tc>
-        <w:tc>
-          <w:tcPr>
-            <w:tcW w:w="4050" w:type="dxa"/>
-          </w:tcPr>
-          <w:p>
-            <w:pPr>
-              <w:jc w:val="left"/>
-            </w:pPr>
-            <w:r>
-              <w:rPr>
-                <w:sz w:val="18"/>
-              </w:rPr>
-              <w:t xml:space="preserve">80%</w:t>
-            </w:r>
-          </w:p>
-        </w:tc>
-      </w:tr>
-      <w:tr>
-        <w:tc>
-          <w:tcPr>
-            <w:tcW w:w="2700" w:type="dxa"/>
-          </w:tcPr>
-          <w:p>
-            <w:pPr>
-              <w:jc w:val="left"/>
-            </w:pPr>
-            <w:r>
-              <w:rPr>
-                <w:sz w:val="18"/>
-              </w:rPr>
-              <w:t xml:space="preserve">precision@20</w:t>
-            </w:r>
-          </w:p>
-        </w:tc>
-        <w:tc>
-          <w:tcPr>
-            <w:tcW w:w="2250" w:type="dxa"/>
-          </w:tcPr>
-          <w:p>
-            <w:pPr>
-              <w:jc w:val="left"/>
-            </w:pPr>
-            <w:r>
-              <w:rPr>
-                <w:sz w:val="18"/>
-              </w:rPr>
-              <w:t xml:space="preserve">17 / 20</w:t>
-            </w:r>
-          </w:p>
-        </w:tc>
-        <w:tc>
-          <w:tcPr>
-            <w:tcW w:w="4050" w:type="dxa"/>
-          </w:tcPr>
-          <w:p>
-            <w:pPr>
-              <w:jc w:val="left"/>
-            </w:pPr>
-            <w:r>
-              <w:rPr>
-                <w:sz w:val="18"/>
-              </w:rPr>
-              <w:t xml:space="preserve">85%</w:t>
-            </w:r>
-          </w:p>
-        </w:tc>
-      </w:tr>
-      <w:tr>
-        <w:tc>
-          <w:tcPr>
-            <w:tcW w:w="2700" w:type="dxa"/>
-          </w:tcPr>
-          <w:p>
-            <w:pPr>
-              <w:jc w:val="left"/>
-            </w:pPr>
-            <w:r>
-              <w:rPr>
-                <w:sz w:val="18"/>
-              </w:rPr>
-              <w:t xml:space="preserve">precision@30</w:t>
-            </w:r>
-          </w:p>
-        </w:tc>
-        <w:tc>
-          <w:tcPr>
-            <w:tcW w:w="2250" w:type="dxa"/>
-          </w:tcPr>
-          <w:p>
-            <w:pPr>
-              <w:jc w:val="left"/>
-            </w:pPr>
-            <w:r>
-              <w:rPr>
-                <w:sz w:val="18"/>
-              </w:rPr>
-              <w:t xml:space="preserve">23 / 30</w:t>
-            </w:r>
-          </w:p>
-        </w:tc>
-        <w:tc>
-          <w:tcPr>
-            <w:tcW w:w="4050" w:type="dxa"/>
-          </w:tcPr>
-          <w:p>
-            <w:pPr>
-              <w:jc w:val="left"/>
-            </w:pPr>
-            <w:r>
-              <w:rPr>
-                <w:sz w:val="18"/>
-              </w:rPr>
-              <w:t xml:space="preserve">77%</w:t>
-            </w:r>
-          </w:p>
-        </w:tc>
-      </w:tr>
-      <w:tr>
-        <w:tc>
-          <w:tcPr>
-            <w:tcW w:w="2700" w:type="dxa"/>
-          </w:tcPr>
-          <w:p>
-            <w:pPr>
-              <w:jc w:val="left"/>
-            </w:pPr>
-            <w:r>
-              <w:rPr>
-                <w:sz w:val="18"/>
-              </w:rPr>
-              <w:t xml:space="preserve">Random baseline</w:t>
-            </w:r>
-          </w:p>
-        </w:tc>
-        <w:tc>
-          <w:tcPr>
-            <w:tcW w:w="2250" w:type="dxa"/>
-          </w:tcPr>
-          <w:p>
-            <w:pPr>
-              <w:jc w:val="left"/>
-            </w:pPr>
-            <w:r>
-              <w:rPr>
-                <w:sz w:val="18"/>
-              </w:rPr>
-              <w:t xml:space="preserve">—</w:t>
-            </w:r>
-          </w:p>
-        </w:tc>
-        <w:tc>
-          <w:tcPr>
-            <w:tcW w:w="4050" w:type="dxa"/>
-          </w:tcPr>
-          <w:p>
-            <w:pPr>
-              <w:jc w:val="left"/>
-            </w:pPr>
-            <w:r>
-              <w:rPr>
-                <w:sz w:val="18"/>
-              </w:rPr>
-              <w:t xml:space="preserve">23%</w:t>
-            </w:r>
-          </w:p>
-        </w:tc>
-      </w:tr>
-    </w:tbl>
-    <w:p/>
-    <w:p>
-      <w:pPr>
-        <w:pStyle w:val="TableCaption"/>
-      </w:pPr>
-      <w:r>
-        <w:t xml:space="preserve">Table 3. Relationship ranking precision at increasing cut-offs. A random ranking scores 23%.</w:t>
+        <w:t xml:space="preserve">Removing one dimension at a time shows methodology matters most and citation least. Removing the dataset dimension improves nDCG@10 from 0.737 to 0.777, because clusters A and C share ImageNet. Our weights are not optimal: 26% of 300 random weightings beat them on nDCG@10. We kept them because they were fixed before evaluation, and tuning on the same thirty papers would make the numbers optimistic. Both errors in the top ten pair MoCo or BYOL with a convolutional paper, a relationship that is real and that our labels count as a miss. Figure 3 shows all 435 scores ordered by cluster.</w:t>
       </w:r>
     </w:p>
     <w:p>
@@ -1836,7 +2363,7 @@
           <wp:inline distT="0" distB="0" distL="0" distR="0">
             <wp:extent cx="2743200" cy="2453377"/>
             <wp:effectExtent l="0" t="0" r="0" b="0"/>
-            <wp:docPr id="2231" name="fig2_heatmap.png"/>
+            <wp:docPr id="51436" name="fig2_heatmap.png"/>
             <wp:cNvGraphicFramePr>
               <a:graphicFrameLocks xmlns:a="http://schemas.openxmlformats.org/drawingml/2006/main" noChangeAspect="1"/>
             </wp:cNvGraphicFramePr>
@@ -1848,7 +2375,7 @@
                     <pic:cNvPicPr/>
                   </pic:nvPicPr>
                   <pic:blipFill>
-                    <a:blip r:embed="rIdFig4"/>
+                    <a:blip r:embed="rIdFig3"/>
                     <a:stretch>
                       <a:fillRect/>
                     </a:stretch>
@@ -1874,7 +2401,21 @@
         <w:pStyle w:val="FigureCaption"/>
       </w:pPr>
       <w:r>
-        <w:t xml:space="preserve">FIGURE 4. Composite relationship score for all 435 document pairs, ordered by topical cluster. Blocks on the diagonal are within-cluster pairs. The pale lower-left region is cluster A against cluster D, the negative control. The diagonal itself is masked; a document is not scored against itself.</w:t>
+        <w:rPr>
+          <w:b/>
+        </w:rPr>
+        <w:t xml:space="preserve">FIGURE 3. </w:t>
+      </w:r>
+      <w:r>
+        <w:t xml:space="preserve">Composite relationship score for all 435 document pairs, ordered by topical cluster. The pale lower-left region is cluster A against cluster D, the negative control.</w:t>
+      </w:r>
+    </w:p>
+    <w:p>
+      <w:pPr>
+        <w:pStyle w:val="Heading2"/>
+      </w:pPr>
+      <w:r>
+        <w:t xml:space="preserve">Graph-level Analysis</w:t>
       </w:r>
     </w:p>
     <w:p>
@@ -1882,47 +2423,7 @@
         <w:pStyle w:val="Paragraph"/>
       </w:pPr>
       <w:r>
-        <w:t xml:space="preserve">Mean within-cluster score was 0.463 against 0.331 across clusters, a separation of 0.132. The separation matters more than the precision figures, because it indicates that the score is discriminative rather than merely correctly ordered at the top.</w:t>
-      </w:r>
-    </w:p>
-    <w:p>
-      <w:pPr>
-        <w:pStyle w:val="Paragraph"/>
-      </w:pPr>
-      <w:r>
-        <w:t xml:space="preserve">The two errors in the top ten are instructive rather than embarrassing. Both pair a self-supervised vision paper from cluster C with a convolutional architecture paper from cluster A, and both are arguably correct: MoCo [15] and ResNet [14] genuinely are closely related, since MoCo evaluates its representations on ImageNet using a ResNet backbone. Our cluster assignment treats them as different because one studies architecture and the other studies pretraining. The score is picking up a real relationship that our ground truth, by design, calls a miss.</w:t>
-      </w:r>
-    </w:p>
-    <w:p>
-      <w:pPr>
-        <w:pStyle w:val="Heading2"/>
-      </w:pPr>
-      <w:r>
-        <w:t xml:space="preserve">Contradictions and gaps</w:t>
-      </w:r>
-    </w:p>
-    <w:p>
-      <w:pPr>
-        <w:pStyle w:val="Paragraph"/>
-      </w:pPr>
-      <w:r>
-        <w:t xml:space="preserve">On the arXiv corpus the system confirmed no contradictions. It also produced no false positives. We report both halves of that result because the second is meaningful only alongside the first, and because an earlier configuration confirmed 1,454 contradictions on the same corpus, essentially all of them spurious. The successive gates described in Section 3.4 brought that figure to 79, then to 10, then to zero as each gate was added.</w:t>
-      </w:r>
-    </w:p>
-    <w:p>
-      <w:pPr>
-        <w:pStyle w:val="Paragraph"/>
-      </w:pPr>
-      <w:r>
-        <w:t xml:space="preserve">Whether zero is the right answer we cannot say from this corpus alone. To check that recall had not simply been destroyed, we constructed a six-paper synthetic corpus containing two deliberately planted contradictions, each a pair of papers reporting materially different values for the same metric on the same dataset. Both are detected and confirmed, and this is asserted by the automated test suite. The honest reading is that the confirmation rule is calibrated conservatively, and that real cross-paper numeric disagreement in this particular literature is usually accompanied by differences in experimental condition that the detector correctly declines to call a contradiction.</w:t>
-      </w:r>
-    </w:p>
-    <w:p>
-      <w:pPr>
-        <w:pStyle w:val="Paragraph"/>
-      </w:pPr>
-      <w:r>
-        <w:t xml:space="preserve">Figure 5 shows a gap as reported, with the trail that makes it checkable.</w:t>
+        <w:t xml:space="preserve">The graph, built with NetworkX [18], has 1,159 nodes (30 papers, 1,037 entities, 92 bridge concepts) and 2,047 edges, one connected component, density 0.0030, and only about 100 extracted relations beside the structural edges. Louvain community detection [20] on the whole graph finds 21 communities (modularity 0.57), nearly pure with respect to clusters (purity 0.97) but fragmenting each cluster (adjusted Rand index 0.25). On the 435-edge paper network Louvain finds just two communities, clusters A with C (image) and B with D (language and retrieval), with modularity 0.08, ARI 0.48 and NMI 0.67: a sensible split, coarser than our four clusters, because the mean score between A and C (0.45) is almost that within A (0.48). Keeping only edges of at least 0.50 leaves 49 of 435, 73% within a cluster, and communities that are pure except for the A and C mix, at the cost of seven isolated papers (Figure 4). The 92 bridge concepts span 5.1 papers on average and 71% cross clusters, but the widest, "accuracy" (28 papers), is generic.</w:t>
       </w:r>
     </w:p>
     <w:p>
@@ -1932,9 +2433,9 @@
       <w:r>
         <w:drawing>
           <wp:inline distT="0" distB="0" distL="0" distR="0">
-            <wp:extent cx="4754880" cy="776306"/>
+            <wp:extent cx="3142488" cy="2828544"/>
             <wp:effectExtent l="0" t="0" r="0" b="0"/>
-            <wp:docPr id="12539" name="fig5_evidence.png"/>
+            <wp:docPr id="58359" name="graph_communities.png"/>
             <wp:cNvGraphicFramePr>
               <a:graphicFrameLocks xmlns:a="http://schemas.openxmlformats.org/drawingml/2006/main" noChangeAspect="1"/>
             </wp:cNvGraphicFramePr>
@@ -1942,11 +2443,11 @@
               <a:graphicData uri="http://schemas.openxmlformats.org/drawingml/2006/picture">
                 <pic:pic xmlns:pic="http://schemas.openxmlformats.org/drawingml/2006/picture">
                   <pic:nvPicPr>
-                    <pic:cNvPr id="0" name="fig5_evidence.png"/>
+                    <pic:cNvPr id="0" name="graph_communities.png"/>
                     <pic:cNvPicPr/>
                   </pic:nvPicPr>
                   <pic:blipFill>
-                    <a:blip r:embed="rIdFig5"/>
+                    <a:blip r:embed="rIdFig4"/>
                     <a:stretch>
                       <a:fillRect/>
                     </a:stretch>
@@ -1954,7 +2455,7 @@
                   <pic:spPr>
                     <a:xfrm>
                       <a:off x="0" y="0"/>
-                      <a:ext cx="4754880" cy="776306"/>
+                      <a:ext cx="3142488" cy="2828544"/>
                     </a:xfrm>
                     <a:prstGeom prst="rect">
                       <a:avLst/>
@@ -1972,7 +2473,21 @@
         <w:pStyle w:val="FigureCaption"/>
       </w:pPr>
       <w:r>
-        <w:t xml:space="preserve">FIGURE 5. A reported gap with its evidence trail: the finding, the paper supporting it, the verbatim sentence, and the provenance - document, section, page - that makes it checkable against the source.</w:t>
+        <w:rPr>
+          <w:b/>
+        </w:rPr>
+        <w:t xml:space="preserve">FIGURE 4. </w:t>
+      </w:r>
+      <w:r>
+        <w:t xml:space="preserve">The paper network at a score threshold of 0.50. Colour is the community found by Louvain on the full weighted network; shape is the assigned cluster.</w:t>
+      </w:r>
+    </w:p>
+    <w:p>
+      <w:pPr>
+        <w:pStyle w:val="Heading2"/>
+      </w:pPr>
+      <w:r>
+        <w:t xml:space="preserve">Contradictions and Gaps</w:t>
       </w:r>
     </w:p>
     <w:p>
@@ -1980,23 +2495,670 @@
         <w:pStyle w:val="Paragraph"/>
       </w:pPr>
       <w:r>
-        <w:t xml:space="preserve">Gap discovery returned five gaps from 1,037 extracted entities and 92 bridge concepts. The resulting knowledge graph contains 1,159 nodes and 2,047 edges. We do not report precision for gaps, because no ground truth exists and constructing one would require an expert to label thousands of candidate pairings. Reporting an unvalidated number would be worse than reporting none, so the gaps are presented with their evidence trails for human judgement.</w:t>
-      </w:r>
-    </w:p>
-    <w:p>
-      <w:pPr>
-        <w:pStyle w:val="Heading2"/>
-      </w:pPr>
-      <w:r>
-        <w:t xml:space="preserve">Runtime</w:t>
-      </w:r>
-    </w:p>
+        <w:t xml:space="preserve">On the real corpus the detector compares 10,176 claim pairs from 424 candidate document pairs. Table 3 adds the gates in the order the code applies them. With none, 4,867 claim pairs look like disagreements, simply because two sentences contain different numbers; the comparability check G5 takes 32 to 1, and the final result is 0 findings. There are no labels on the real corpus, so we report counts, not precision. On the labelled corpus the first gate alone brings precision from 0.15 to 1.00 with recall 1.00, but the corpus is too simple to tell the later gates apart.</w:t>
+      </w:r>
+    </w:p>
+    <w:p>
+      <w:pPr>
+        <w:pStyle w:val="TableCaption"/>
+      </w:pPr>
+      <w:r>
+        <w:rPr>
+          <w:b/>
+        </w:rPr>
+        <w:t xml:space="preserve">TABLE 3. </w:t>
+      </w:r>
+      <w:r>
+        <w:t xml:space="preserve">Contradiction gates, cumulative, in the order the code applies them. Real: claim pairs still flagged on the 30-paper corpus (no labels). Labelled: true/false positive document pairs on the six-paper corpus (two planted).</w:t>
+      </w:r>
+    </w:p>
+    <w:tbl>
+      <w:tblPr>
+        <w:tblW w:w="9000" w:type="dxa"/>
+        <w:jc w:val="center"/>
+        <w:tblLayout w:type="fixed"/>
+        <w:tblCellMar>
+          <w:left w:w="70" w:type="dxa"/>
+          <w:right w:w="70" w:type="dxa"/>
+        </w:tblCellMar>
+        <w:tblLook w:val="0000" w:firstRow="0" w:lastRow="0" w:firstColumn="0" w:lastColumn="0" w:noHBand="0" w:noVBand="0"/>
+      </w:tblPr>
+      <w:tblGrid>
+        <w:gridCol w:w="4500"/>
+        <w:gridCol w:w="1980"/>
+        <w:gridCol w:w="2520"/>
+      </w:tblGrid>
+      <w:tr>
+        <w:trPr>
+          <w:cantSplit/>
+          <w:tblHeader/>
+        </w:trPr>
+        <w:tc>
+          <w:tcPr>
+            <w:tcW w:w="4500" w:type="dxa"/>
+            <w:tcBorders>
+              <w:top w:val="single" w:sz="4" w:space="0" w:color="000000"/>
+              <w:bottom w:val="single" w:sz="4" w:space="0" w:color="000000"/>
+            </w:tcBorders>
+          </w:tcPr>
+          <w:p>
+            <w:pPr>
+              <w:ind w:firstLine="0"/>
+              <w:jc w:val="left"/>
+            </w:pPr>
+            <w:r>
+              <w:rPr>
+                <w:b/>
+                <w:sz w:val="18"/>
+                <w:szCs w:val="18"/>
+              </w:rPr>
+              <w:t xml:space="preserve">Gate</w:t>
+            </w:r>
+          </w:p>
+        </w:tc>
+        <w:tc>
+          <w:tcPr>
+            <w:tcW w:w="1980" w:type="dxa"/>
+            <w:tcBorders>
+              <w:top w:val="single" w:sz="4" w:space="0" w:color="000000"/>
+              <w:bottom w:val="single" w:sz="4" w:space="0" w:color="000000"/>
+            </w:tcBorders>
+          </w:tcPr>
+          <w:p>
+            <w:pPr>
+              <w:ind w:firstLine="0"/>
+              <w:jc w:val="center"/>
+            </w:pPr>
+            <w:r>
+              <w:rPr>
+                <w:b/>
+                <w:sz w:val="18"/>
+                <w:szCs w:val="18"/>
+              </w:rPr>
+              <w:t xml:space="preserve">Real</w:t>
+            </w:r>
+          </w:p>
+        </w:tc>
+        <w:tc>
+          <w:tcPr>
+            <w:tcW w:w="2520" w:type="dxa"/>
+            <w:tcBorders>
+              <w:top w:val="single" w:sz="4" w:space="0" w:color="000000"/>
+              <w:bottom w:val="single" w:sz="4" w:space="0" w:color="000000"/>
+            </w:tcBorders>
+          </w:tcPr>
+          <w:p>
+            <w:pPr>
+              <w:ind w:firstLine="0"/>
+              <w:jc w:val="center"/>
+            </w:pPr>
+            <w:r>
+              <w:rPr>
+                <w:b/>
+                <w:sz w:val="18"/>
+                <w:szCs w:val="18"/>
+              </w:rPr>
+              <w:t xml:space="preserve">Labelled TP/FP</w:t>
+            </w:r>
+          </w:p>
+        </w:tc>
+      </w:tr>
+      <w:tr>
+        <w:trPr>
+          <w:cantSplit/>
+        </w:trPr>
+        <w:tc>
+          <w:tcPr>
+            <w:tcW w:w="4500" w:type="dxa"/>
+          </w:tcPr>
+          <w:p>
+            <w:pPr>
+              <w:ind w:firstLine="0"/>
+              <w:jc w:val="left"/>
+            </w:pPr>
+            <w:r>
+              <w:rPr>
+                <w:sz w:val="20"/>
+                <w:szCs w:val="20"/>
+              </w:rPr>
+              <w:t xml:space="preserve">No gates</w:t>
+            </w:r>
+          </w:p>
+        </w:tc>
+        <w:tc>
+          <w:tcPr>
+            <w:tcW w:w="1980" w:type="dxa"/>
+          </w:tcPr>
+          <w:p>
+            <w:pPr>
+              <w:ind w:firstLine="0"/>
+              <w:jc w:val="center"/>
+            </w:pPr>
+            <w:r>
+              <w:rPr>
+                <w:sz w:val="20"/>
+                <w:szCs w:val="20"/>
+              </w:rPr>
+              <w:t xml:space="preserve">4,867</w:t>
+            </w:r>
+          </w:p>
+        </w:tc>
+        <w:tc>
+          <w:tcPr>
+            <w:tcW w:w="2520" w:type="dxa"/>
+          </w:tcPr>
+          <w:p>
+            <w:pPr>
+              <w:ind w:firstLine="0"/>
+              <w:jc w:val="center"/>
+            </w:pPr>
+            <w:r>
+              <w:rPr>
+                <w:sz w:val="20"/>
+                <w:szCs w:val="20"/>
+              </w:rPr>
+              <w:t xml:space="preserve">2/11</w:t>
+            </w:r>
+          </w:p>
+        </w:tc>
+      </w:tr>
+      <w:tr>
+        <w:trPr>
+          <w:cantSplit/>
+        </w:trPr>
+        <w:tc>
+          <w:tcPr>
+            <w:tcW w:w="4500" w:type="dxa"/>
+          </w:tcPr>
+          <w:p>
+            <w:pPr>
+              <w:ind w:firstLine="0"/>
+              <w:jc w:val="left"/>
+            </w:pPr>
+            <w:r>
+              <w:rPr>
+                <w:sz w:val="20"/>
+                <w:szCs w:val="20"/>
+              </w:rPr>
+              <w:t xml:space="preserve">G1 shared term</w:t>
+            </w:r>
+          </w:p>
+        </w:tc>
+        <w:tc>
+          <w:tcPr>
+            <w:tcW w:w="1980" w:type="dxa"/>
+          </w:tcPr>
+          <w:p>
+            <w:pPr>
+              <w:ind w:firstLine="0"/>
+              <w:jc w:val="center"/>
+            </w:pPr>
+            <w:r>
+              <w:rPr>
+                <w:sz w:val="20"/>
+                <w:szCs w:val="20"/>
+              </w:rPr>
+              <w:t xml:space="preserve">1,789</w:t>
+            </w:r>
+          </w:p>
+        </w:tc>
+        <w:tc>
+          <w:tcPr>
+            <w:tcW w:w="2520" w:type="dxa"/>
+          </w:tcPr>
+          <w:p>
+            <w:pPr>
+              <w:ind w:firstLine="0"/>
+              <w:jc w:val="center"/>
+            </w:pPr>
+            <w:r>
+              <w:rPr>
+                <w:sz w:val="20"/>
+                <w:szCs w:val="20"/>
+              </w:rPr>
+              <w:t xml:space="preserve">2/0</w:t>
+            </w:r>
+          </w:p>
+        </w:tc>
+      </w:tr>
+      <w:tr>
+        <w:trPr>
+          <w:cantSplit/>
+        </w:trPr>
+        <w:tc>
+          <w:tcPr>
+            <w:tcW w:w="4500" w:type="dxa"/>
+          </w:tcPr>
+          <w:p>
+            <w:pPr>
+              <w:ind w:firstLine="0"/>
+              <w:jc w:val="left"/>
+            </w:pPr>
+            <w:r>
+              <w:rPr>
+                <w:sz w:val="20"/>
+                <w:szCs w:val="20"/>
+              </w:rPr>
+              <w:t xml:space="preserve">G2 same dataset</w:t>
+            </w:r>
+          </w:p>
+        </w:tc>
+        <w:tc>
+          <w:tcPr>
+            <w:tcW w:w="1980" w:type="dxa"/>
+          </w:tcPr>
+          <w:p>
+            <w:pPr>
+              <w:ind w:firstLine="0"/>
+              <w:jc w:val="center"/>
+            </w:pPr>
+            <w:r>
+              <w:rPr>
+                <w:sz w:val="20"/>
+                <w:szCs w:val="20"/>
+              </w:rPr>
+              <w:t xml:space="preserve">87</w:t>
+            </w:r>
+          </w:p>
+        </w:tc>
+        <w:tc>
+          <w:tcPr>
+            <w:tcW w:w="2520" w:type="dxa"/>
+          </w:tcPr>
+          <w:p>
+            <w:pPr>
+              <w:ind w:firstLine="0"/>
+              <w:jc w:val="center"/>
+            </w:pPr>
+            <w:r>
+              <w:rPr>
+                <w:sz w:val="20"/>
+                <w:szCs w:val="20"/>
+              </w:rPr>
+              <w:t xml:space="preserve">2/0</w:t>
+            </w:r>
+          </w:p>
+        </w:tc>
+      </w:tr>
+      <w:tr>
+        <w:trPr>
+          <w:cantSplit/>
+        </w:trPr>
+        <w:tc>
+          <w:tcPr>
+            <w:tcW w:w="4500" w:type="dxa"/>
+          </w:tcPr>
+          <w:p>
+            <w:pPr>
+              <w:ind w:firstLine="0"/>
+              <w:jc w:val="left"/>
+            </w:pPr>
+            <w:r>
+              <w:rPr>
+                <w:sz w:val="20"/>
+                <w:szCs w:val="20"/>
+              </w:rPr>
+              <w:t xml:space="preserve">G3 same system</w:t>
+            </w:r>
+          </w:p>
+        </w:tc>
+        <w:tc>
+          <w:tcPr>
+            <w:tcW w:w="1980" w:type="dxa"/>
+          </w:tcPr>
+          <w:p>
+            <w:pPr>
+              <w:ind w:firstLine="0"/>
+              <w:jc w:val="center"/>
+            </w:pPr>
+            <w:r>
+              <w:rPr>
+                <w:sz w:val="20"/>
+                <w:szCs w:val="20"/>
+              </w:rPr>
+              <w:t xml:space="preserve">74</w:t>
+            </w:r>
+          </w:p>
+        </w:tc>
+        <w:tc>
+          <w:tcPr>
+            <w:tcW w:w="2520" w:type="dxa"/>
+          </w:tcPr>
+          <w:p>
+            <w:pPr>
+              <w:ind w:firstLine="0"/>
+              <w:jc w:val="center"/>
+            </w:pPr>
+            <w:r>
+              <w:rPr>
+                <w:sz w:val="20"/>
+                <w:szCs w:val="20"/>
+              </w:rPr>
+              <w:t xml:space="preserve">2/0</w:t>
+            </w:r>
+          </w:p>
+        </w:tc>
+      </w:tr>
+      <w:tr>
+        <w:trPr>
+          <w:cantSplit/>
+        </w:trPr>
+        <w:tc>
+          <w:tcPr>
+            <w:tcW w:w="4500" w:type="dxa"/>
+          </w:tcPr>
+          <w:p>
+            <w:pPr>
+              <w:ind w:firstLine="0"/>
+              <w:jc w:val="left"/>
+            </w:pPr>
+            <w:r>
+              <w:rPr>
+                <w:sz w:val="20"/>
+                <w:szCs w:val="20"/>
+              </w:rPr>
+              <w:t xml:space="preserve">G4 asserts a result</w:t>
+            </w:r>
+          </w:p>
+        </w:tc>
+        <w:tc>
+          <w:tcPr>
+            <w:tcW w:w="1980" w:type="dxa"/>
+          </w:tcPr>
+          <w:p>
+            <w:pPr>
+              <w:ind w:firstLine="0"/>
+              <w:jc w:val="center"/>
+            </w:pPr>
+            <w:r>
+              <w:rPr>
+                <w:sz w:val="20"/>
+                <w:szCs w:val="20"/>
+              </w:rPr>
+              <w:t xml:space="preserve">32</w:t>
+            </w:r>
+          </w:p>
+        </w:tc>
+        <w:tc>
+          <w:tcPr>
+            <w:tcW w:w="2520" w:type="dxa"/>
+          </w:tcPr>
+          <w:p>
+            <w:pPr>
+              <w:ind w:firstLine="0"/>
+              <w:jc w:val="center"/>
+            </w:pPr>
+            <w:r>
+              <w:rPr>
+                <w:sz w:val="20"/>
+                <w:szCs w:val="20"/>
+              </w:rPr>
+              <w:t xml:space="preserve">2/0</w:t>
+            </w:r>
+          </w:p>
+        </w:tc>
+      </w:tr>
+      <w:tr>
+        <w:trPr>
+          <w:cantSplit/>
+        </w:trPr>
+        <w:tc>
+          <w:tcPr>
+            <w:tcW w:w="4500" w:type="dxa"/>
+          </w:tcPr>
+          <w:p>
+            <w:pPr>
+              <w:ind w:firstLine="0"/>
+              <w:jc w:val="left"/>
+            </w:pPr>
+            <w:r>
+              <w:rPr>
+                <w:sz w:val="20"/>
+                <w:szCs w:val="20"/>
+              </w:rPr>
+              <w:t xml:space="preserve">G5 comparable</w:t>
+            </w:r>
+          </w:p>
+        </w:tc>
+        <w:tc>
+          <w:tcPr>
+            <w:tcW w:w="1980" w:type="dxa"/>
+          </w:tcPr>
+          <w:p>
+            <w:pPr>
+              <w:ind w:firstLine="0"/>
+              <w:jc w:val="center"/>
+            </w:pPr>
+            <w:r>
+              <w:rPr>
+                <w:sz w:val="20"/>
+                <w:szCs w:val="20"/>
+              </w:rPr>
+              <w:t xml:space="preserve">1</w:t>
+            </w:r>
+          </w:p>
+        </w:tc>
+        <w:tc>
+          <w:tcPr>
+            <w:tcW w:w="2520" w:type="dxa"/>
+          </w:tcPr>
+          <w:p>
+            <w:pPr>
+              <w:ind w:firstLine="0"/>
+              <w:jc w:val="center"/>
+            </w:pPr>
+            <w:r>
+              <w:rPr>
+                <w:sz w:val="20"/>
+                <w:szCs w:val="20"/>
+              </w:rPr>
+              <w:t xml:space="preserve">2/0</w:t>
+            </w:r>
+          </w:p>
+        </w:tc>
+      </w:tr>
+      <w:tr>
+        <w:trPr>
+          <w:cantSplit/>
+        </w:trPr>
+        <w:tc>
+          <w:tcPr>
+            <w:tcW w:w="4500" w:type="dxa"/>
+          </w:tcPr>
+          <w:p>
+            <w:pPr>
+              <w:ind w:firstLine="0"/>
+              <w:jc w:val="left"/>
+            </w:pPr>
+            <w:r>
+              <w:rPr>
+                <w:sz w:val="20"/>
+                <w:szCs w:val="20"/>
+              </w:rPr>
+              <w:t xml:space="preserve">G6 gap of 5% or more</w:t>
+            </w:r>
+          </w:p>
+        </w:tc>
+        <w:tc>
+          <w:tcPr>
+            <w:tcW w:w="1980" w:type="dxa"/>
+          </w:tcPr>
+          <w:p>
+            <w:pPr>
+              <w:ind w:firstLine="0"/>
+              <w:jc w:val="center"/>
+            </w:pPr>
+            <w:r>
+              <w:rPr>
+                <w:sz w:val="20"/>
+                <w:szCs w:val="20"/>
+              </w:rPr>
+              <w:t xml:space="preserve">0</w:t>
+            </w:r>
+          </w:p>
+        </w:tc>
+        <w:tc>
+          <w:tcPr>
+            <w:tcW w:w="2520" w:type="dxa"/>
+          </w:tcPr>
+          <w:p>
+            <w:pPr>
+              <w:ind w:firstLine="0"/>
+              <w:jc w:val="center"/>
+            </w:pPr>
+            <w:r>
+              <w:rPr>
+                <w:sz w:val="20"/>
+                <w:szCs w:val="20"/>
+              </w:rPr>
+              <w:t xml:space="preserve">2/0</w:t>
+            </w:r>
+          </w:p>
+        </w:tc>
+      </w:tr>
+      <w:tr>
+        <w:trPr>
+          <w:cantSplit/>
+        </w:trPr>
+        <w:tc>
+          <w:tcPr>
+            <w:tcW w:w="4500" w:type="dxa"/>
+          </w:tcPr>
+          <w:p>
+            <w:pPr>
+              <w:ind w:firstLine="0"/>
+              <w:jc w:val="left"/>
+            </w:pPr>
+            <w:r>
+              <w:rPr>
+                <w:sz w:val="20"/>
+                <w:szCs w:val="20"/>
+              </w:rPr>
+              <w:t xml:space="preserve">G7 shared dataset/metric</w:t>
+            </w:r>
+          </w:p>
+        </w:tc>
+        <w:tc>
+          <w:tcPr>
+            <w:tcW w:w="1980" w:type="dxa"/>
+          </w:tcPr>
+          <w:p>
+            <w:pPr>
+              <w:ind w:firstLine="0"/>
+              <w:jc w:val="center"/>
+            </w:pPr>
+            <w:r>
+              <w:rPr>
+                <w:sz w:val="20"/>
+                <w:szCs w:val="20"/>
+              </w:rPr>
+              <w:t xml:space="preserve">0</w:t>
+            </w:r>
+          </w:p>
+        </w:tc>
+        <w:tc>
+          <w:tcPr>
+            <w:tcW w:w="2520" w:type="dxa"/>
+          </w:tcPr>
+          <w:p>
+            <w:pPr>
+              <w:ind w:firstLine="0"/>
+              <w:jc w:val="center"/>
+            </w:pPr>
+            <w:r>
+              <w:rPr>
+                <w:sz w:val="20"/>
+                <w:szCs w:val="20"/>
+              </w:rPr>
+              <w:t xml:space="preserve">2/0</w:t>
+            </w:r>
+          </w:p>
+        </w:tc>
+      </w:tr>
+      <w:tr>
+        <w:trPr>
+          <w:cantSplit/>
+        </w:trPr>
+        <w:tc>
+          <w:tcPr>
+            <w:tcW w:w="4500" w:type="dxa"/>
+            <w:tcBorders>
+              <w:bottom w:val="single" w:sz="4" w:space="0" w:color="000000"/>
+            </w:tcBorders>
+          </w:tcPr>
+          <w:p>
+            <w:pPr>
+              <w:ind w:firstLine="0"/>
+              <w:jc w:val="left"/>
+            </w:pPr>
+            <w:r>
+              <w:rPr>
+                <w:sz w:val="20"/>
+                <w:szCs w:val="20"/>
+              </w:rPr>
+              <w:t xml:space="preserve">G8 similarity and confidence</w:t>
+            </w:r>
+          </w:p>
+        </w:tc>
+        <w:tc>
+          <w:tcPr>
+            <w:tcW w:w="1980" w:type="dxa"/>
+            <w:tcBorders>
+              <w:bottom w:val="single" w:sz="4" w:space="0" w:color="000000"/>
+            </w:tcBorders>
+          </w:tcPr>
+          <w:p>
+            <w:pPr>
+              <w:ind w:firstLine="0"/>
+              <w:jc w:val="center"/>
+            </w:pPr>
+            <w:r>
+              <w:rPr>
+                <w:sz w:val="20"/>
+                <w:szCs w:val="20"/>
+              </w:rPr>
+              <w:t xml:space="preserve">0</w:t>
+            </w:r>
+          </w:p>
+        </w:tc>
+        <w:tc>
+          <w:tcPr>
+            <w:tcW w:w="2520" w:type="dxa"/>
+            <w:tcBorders>
+              <w:bottom w:val="single" w:sz="4" w:space="0" w:color="000000"/>
+            </w:tcBorders>
+          </w:tcPr>
+          <w:p>
+            <w:pPr>
+              <w:ind w:firstLine="0"/>
+              <w:jc w:val="center"/>
+            </w:pPr>
+            <w:r>
+              <w:rPr>
+                <w:sz w:val="20"/>
+                <w:szCs w:val="20"/>
+              </w:rPr>
+              <w:t xml:space="preserve">2/0</w:t>
+            </w:r>
+          </w:p>
+        </w:tc>
+      </w:tr>
+    </w:tbl>
+    <w:p/>
     <w:p>
       <w:pPr>
         <w:pStyle w:val="Paragraph"/>
       </w:pPr>
       <w:r>
-        <w:t xml:space="preserve">A full analysis of thirty papers takes about 33 seconds on a four-core CPU with no GPU and no network, once the embedding model is resident; embedding is roughly half of that. The inference-based detector raises it sharply, and its calls had to be batched with a capped batch size: one model call per claim pair exhausted CPU memory.</w:t>
+        <w:t xml:space="preserve">At the default thresholds the numeric detector finds both planted contradictions and nothing else (precision, recall and F1 all 1.00). Adding the inference model keeps recall at 1.00 but confirms 6 document pairs, 4 wrong, so precision falls to 0.33 (F1 0.50). Sweeping the methodology similarity from 0.1 to 0.5 and the confidence from 0.4 to 0.9, the numeric detector is stable (both found, none false) up to a confidence of 0.7 and loses both at 0.8; the inference model's false positives survive every confidence threshold up to 0.8, and a higher similarity threshold removes some (eight false positives at 0.1, three at 0.5) without losing a true one. Moving the candidate-pair threshold from 0.2 to 0.6 changes nothing. Gap discovery returned five gaps from 1,037 entities and 92 bridge concepts; all are stated gaps or limitations, three are genuine open problems in the authors' words, two describe weaknesses of other methods, and two are duplicates of one statement.</w:t>
+      </w:r>
+    </w:p>
+    <w:p>
+      <w:pPr>
+        <w:pStyle w:val="Paragraph"/>
+      </w:pPr>
+      <w:r>
+        <w:t xml:space="preserve">An automatic provenance check found every document, section and quotation correct for all 5 gap records and all 10 records of the planted contradictions, but the page number was one page early in 2 of the 5 gap records. A full analysis of thirty papers takes about 33 seconds on a four-core CPU with the inference model off; with it on, the claim comparison over the real corpus was still running after fifteen minutes.</w:t>
       </w:r>
     </w:p>
     <w:p>
@@ -2004,7 +3166,7 @@
         <w:pStyle w:val="Heading1"/>
       </w:pPr>
       <w:r>
-        <w:t xml:space="preserve">LIMITATIONS</w:t>
+        <w:t xml:space="preserve">DISCUSSION</w:t>
       </w:r>
     </w:p>
     <w:p>
@@ -2012,7 +3174,7 @@
         <w:pStyle w:val="Paragraph"/>
       </w:pPr>
       <w:r>
-        <w:t xml:space="preserve">The weights are asserted rather than learned. Learning them needs a labelled relatedness dataset for this corpus, which does not exist; we regard the scheme's interpretability as partial compensation, not a full answer.</w:t>
+        <w:t xml:space="preserve">Strengths. The score can be taken apart: its five components are stored, the ablation shows which carry weight, and the dimensions are complementary, since the combination beats every single one. Traceability held up under the automatic check. The gates remove essentially every spurious numeric disagreement on the real corpus, and the numeric detector keeps recall on the labelled one. The system is small, offline, and contains no generative language model.</w:t>
       </w:r>
     </w:p>
     <w:p>
@@ -2020,7 +3182,7 @@
         <w:pStyle w:val="Paragraph"/>
       </w:pPr>
       <w:r>
-        <w:t xml:space="preserve">Extraction is rule-based and English-only. Gazetteers transfer poorly to fields whose dataset and metric names we have not enumerated, and a paper in another language would segment correctly while yielding almost no entities. Scanned PDFs yield no text; these are reported as ingestion errors rather than skipped, but no OCR is attempted.</w:t>
+        <w:t xml:space="preserve">Weaknesses. The score does not beat plain full-text TF-IDF, and the dataset dimension hurts on this corpus. Extraction is the thin layer: the graph has 1,037 entities but only about 100 relations, and the word lists are specific to machine learning. The community structure is coarse, with modularity 0.08 on the full network, and generic bridge concepts link nothing in particular. The inference model costs precision. The contradiction result on real papers cannot be scored, so zero findings shows no false positives, not that nothing was missed. Two of five gaps are weak and one page number is wrong in two of five records.</w:t>
       </w:r>
     </w:p>
     <w:p>
@@ -2028,7 +3190,15 @@
         <w:pStyle w:val="Paragraph"/>
       </w:pPr>
       <w:r>
-        <w:t xml:space="preserve">Pair scoring is quadratic. That is irrelevant at thirty papers and tractable at a few hundred, but tens of thousands would need approximate nearest-neighbour retrieval to prune candidates first.</w:t>
+        <w:t xml:space="preserve">Threats to validity. The relevance labels are our cluster assignments, not independent judgements, and cross-cluster pairs that are really related count as misses. The thresholds set by inspection were set on the papers we evaluate on, so the results are not held-out. All thirty papers are machine learning papers, and with thirty queries several differences between methods fall inside the intervals. The main value of the system is explanation and provenance, not ranking accuracy; a reader who only wants the most similar papers should use TF-IDF.</w:t>
+      </w:r>
+    </w:p>
+    <w:p>
+      <w:pPr>
+        <w:pStyle w:val="Heading1"/>
+      </w:pPr>
+      <w:r>
+        <w:t xml:space="preserve">CONCLUSION</w:t>
       </w:r>
     </w:p>
     <w:p>
@@ -2036,7 +3206,7 @@
         <w:pStyle w:val="Paragraph"/>
       </w:pPr>
       <w:r>
-        <w:t xml:space="preserve">Finally, the contradiction result is one data point from one corpus in one field. The gates preserve recall on planted contradictions, but we cannot say what their recall is on real ones without a labelled set of real ones.</w:t>
+        <w:t xml:space="preserve">We have described a pipeline that reads a folder of papers and reports how they relate, where they disagree and what they omit, with every claim traceable to a sentence on a page and without a generative language model. Measured against seven baselines it ranks related papers far above chance and above each of its own dimensions, but not above full-text TF-IDF; its numeric detector finds planted contradictions without false positives; and its graph has real but coarse community structure. Future work is a held-out corpus with hand-labelled real contradictions, learned weights, richer relation extraction and incremental updates. The implementation, the corpus and the evaluation scripts are available so the figures above can be reproduced.</w:t>
       </w:r>
     </w:p>
     <w:p>
@@ -2044,30 +3214,6 @@
         <w:pStyle w:val="Heading1"/>
       </w:pPr>
       <w:r>
-        <w:t xml:space="preserve">CONCLUSION</w:t>
-      </w:r>
-    </w:p>
-    <w:p>
-      <w:pPr>
-        <w:pStyle w:val="Paragraph"/>
-      </w:pPr>
-      <w:r>
-        <w:t xml:space="preserve">We have described a system that reads a folder of papers and reports how they relate, where they disagree and what they omit, with every claim traceable to a sentence on a page. Segmentation by relative font size handled all thirty documents and recovered 90% of expected sections; the five-dimensional score reached 80% precision@10 against a 23% baseline while remaining decomposable. Contradiction detection produced no false positives, and also no confirmed findings on real papers.</w:t>
-      </w:r>
-    </w:p>
-    <w:p>
-      <w:pPr>
-        <w:pStyle w:val="Paragraph"/>
-      </w:pPr>
-      <w:r>
-        <w:t xml:space="preserve">The commitment throughout was that an answer a reader cannot verify is not worth giving. That ruled out several easier architectures and cost accuracy in places, which we think is the right trade for a tool used on literature a researcher will then go and read. The implementation, the corpus and the evaluation scripts are available so the figures above can be reproduced.</w:t>
-      </w:r>
-    </w:p>
-    <w:p>
-      <w:pPr>
-        <w:pStyle w:val="Heading1"/>
-      </w:pPr>
-      <w:r>
         <w:t xml:space="preserve">REFERENCES</w:t>
       </w:r>
     </w:p>
@@ -2076,7 +3222,7 @@
         <w:pStyle w:val="Reference"/>
       </w:pPr>
       <w:r>
-        <w:t xml:space="preserve">Reimers, N., Gurevych, I.: Sentence-BERT: Sentence Embeddings using Siamese BERT-Networks. In: Proceedings of EMNLP-IJCNLP, pp. 3982–3992 (2019).</w:t>
+        <w:t xml:space="preserve">N. Reimers and I. Gurevych, “Sentence-BERT: Sentence Embeddings using Siamese BERT-Networks,” in Proceedings of EMNLP-IJCNLP (2019), pp. 3982–3992.</w:t>
       </w:r>
     </w:p>
     <w:p>
@@ -2084,7 +3230,7 @@
         <w:pStyle w:val="Reference"/>
       </w:pPr>
       <w:r>
-        <w:t xml:space="preserve">Beltagy, I., Lo, K., Cohan, A.: SciBERT: A Pretrained Language Model for Scientific Text. In: Proceedings of EMNLP-IJCNLP, pp. 3615–3620 (2019).</w:t>
+        <w:t xml:space="preserve">I. Beltagy, K. Lo, and A. Cohan, “SciBERT: A Pretrained Language Model for Scientific Text,” in Proceedings of EMNLP-IJCNLP (2019), pp. 3615–3620.</w:t>
       </w:r>
     </w:p>
     <w:p>
@@ -2092,7 +3238,7 @@
         <w:pStyle w:val="Reference"/>
       </w:pPr>
       <w:r>
-        <w:t xml:space="preserve">Cohan, A., Feldman, S., Beltagy, I., Downey, D., Weld, D.S.: SPECTER: Document-level Representation Learning using Citation-informed Transformers. In: Proceedings of ACL, pp. 2270–2282 (2020).</w:t>
+        <w:t xml:space="preserve">A. Cohan, S. Feldman, I. Beltagy, D. Downey, and D. S. Weld, “SPECTER: Document-level Representation Learning using Citation-informed Transformers,” in Proceedings of ACL (2020), pp. 2270–2282.</w:t>
       </w:r>
     </w:p>
     <w:p>
@@ -2100,7 +3246,7 @@
         <w:pStyle w:val="Reference"/>
       </w:pPr>
       <w:r>
-        <w:t xml:space="preserve">Luan, Y., He, L., Ostendorf, M., Hajishirzi, H.: Multi-Task Identification of Entities, Relations, and Coreference for Scientific Knowledge Graph Construction. In: Proceedings of EMNLP, pp. 3219–3232 (2018).</w:t>
+        <w:t xml:space="preserve">Y. Luan, L. He, M. Ostendorf, and H. Hajishirzi, “Multi-Task Identification of Entities, Relations, and Coreference for Scientific Knowledge Graph Construction,” in Proceedings of EMNLP (2018), pp. 3219–3232.</w:t>
       </w:r>
     </w:p>
     <w:p>
@@ -2108,7 +3254,7 @@
         <w:pStyle w:val="Reference"/>
       </w:pPr>
       <w:r>
-        <w:t xml:space="preserve">Yao, Y., Ye, D., Li, P., Han, X., Lin, Y., Liu, Z., Sun, M.: DocRED: A Large-Scale Document-Level Relation Extraction Dataset. In: Proceedings of ACL, pp. 764–777 (2019).</w:t>
+        <w:t xml:space="preserve">Y. Yao, D. Ye, P. Li, X. Han, Y. Lin, Z. Liu, and M. Sun, “DocRED: A Large-Scale Document-Level Relation Extraction Dataset,” in Proceedings of ACL (2019), pp. 764–777.</w:t>
       </w:r>
     </w:p>
     <w:p>
@@ -2116,7 +3262,7 @@
         <w:pStyle w:val="Reference"/>
       </w:pPr>
       <w:r>
-        <w:t xml:space="preserve">Thorne, J., Vlachos, A., Christodoulopoulos, C., Mittal, A.: FEVER: a Large-scale Dataset for Fact Extraction and VERification. In: Proceedings of NAACL-HLT, pp. 809–819 (2018).</w:t>
+        <w:t xml:space="preserve">J. Thorne, A. Vlachos, C. Christodoulopoulos, and A. Mittal, “FEVER: a Large-scale Dataset for Fact Extraction and VERification,” in Proceedings of NAACL-HLT (2018), pp. 809–819.</w:t>
       </w:r>
     </w:p>
     <w:p>
@@ -2124,7 +3270,7 @@
         <w:pStyle w:val="Reference"/>
       </w:pPr>
       <w:r>
-        <w:t xml:space="preserve">Wadden, D., Lin, S., Lo, K., Wang, L.L., van Zuylen, M., Cohan, A., Hajishirzi, H.: Fact or Fiction: Verifying Scientific Claims. In: Proceedings of EMNLP, pp. 7534–7550 (2020).</w:t>
+        <w:t xml:space="preserve">D. Wadden, S. Lin, K. Lo, L. L. Wang, M. van Zuylen, A. Cohan, and H. Hajishirzi, “Fact or Fiction: Verifying Scientific Claims,” in Proceedings of EMNLP (2020), pp. 7534–7550.</w:t>
       </w:r>
     </w:p>
     <w:p>
@@ -2132,7 +3278,7 @@
         <w:pStyle w:val="Reference"/>
       </w:pPr>
       <w:r>
-        <w:t xml:space="preserve">Williams, A., Nangia, N., Bowman, S.: A Broad-Coverage Challenge Corpus for Sentence Understanding through Inference. In: Proceedings of NAACL-HLT, pp. 1112–1122 (2018).</w:t>
+        <w:t xml:space="preserve">A. Williams, N. Nangia, and S. Bowman, “A Broad-Coverage Challenge Corpus for Sentence Understanding through Inference,” in Proceedings of NAACL-HLT (2018), pp. 1112–1122.</w:t>
       </w:r>
     </w:p>
     <w:p>
@@ -2140,7 +3286,7 @@
         <w:pStyle w:val="Reference"/>
       </w:pPr>
       <w:r>
-        <w:t xml:space="preserve">He, P., Liu, X., Gao, J., Chen, W.: DeBERTa: Decoding-enhanced BERT with Disentangled Attention. In: Proceedings of ICLR (2021).</w:t>
+        <w:t xml:space="preserve">P. He, X. Liu, J. Gao, and W. Chen, “DeBERTa: Decoding-enhanced BERT with Disentangled Attention,” in Proceedings of ICLR (2021).</w:t>
       </w:r>
     </w:p>
     <w:p>
@@ -2148,7 +3294,7 @@
         <w:pStyle w:val="Reference"/>
       </w:pPr>
       <w:r>
-        <w:t xml:space="preserve">Kessler, M.M.: Bibliographic coupling between scientific papers. American Documentation 14(1), 10–25 (1963).</w:t>
+        <w:t xml:space="preserve">M. M. Kessler, American Documentation 14, 10–25 (1963).</w:t>
       </w:r>
     </w:p>
     <w:p>
@@ -2156,7 +3302,7 @@
         <w:pStyle w:val="Reference"/>
       </w:pPr>
       <w:r>
-        <w:t xml:space="preserve">Small, H.: Co-citation in the scientific literature: A new measure of the relationship between two documents. Journal of the American Society for Information Science 24(4), 265–269 (1973).</w:t>
+        <w:t xml:space="preserve">H. Small, J. Am. Soc. Inf. Sci. 24, 265–269 (1973).</w:t>
       </w:r>
     </w:p>
     <w:p>
@@ -2164,7 +3310,7 @@
         <w:pStyle w:val="Reference"/>
       </w:pPr>
       <w:r>
-        <w:t xml:space="preserve">Vaswani, A., Shazeer, N., Parmar, N., Uszkoreit, J., Jones, L., Gomez, A.N., Kaiser, Ł., Polosukhin, I.: Attention Is All You Need. In: Advances in Neural Information Processing Systems 30, pp. 5998–6008 (2017).</w:t>
+        <w:t xml:space="preserve">A. Vaswani et al., “Attention Is All You Need,” in Advances in Neural Information Processing Systems 30 (2017), pp. 5998–6008.</w:t>
       </w:r>
     </w:p>
     <w:p>
@@ -2172,7 +3318,7 @@
         <w:pStyle w:val="Reference"/>
       </w:pPr>
       <w:r>
-        <w:t xml:space="preserve">Devlin, J., Chang, M.-W., Lee, K., Toutanova, K.: BERT: Pre-training of Deep Bidirectional Transformers for Language Understanding. In: Proceedings of NAACL-HLT, pp. 4171–4186 (2019).</w:t>
+        <w:t xml:space="preserve">J. Devlin, M.-W. Chang, K. Lee, and K. Toutanova, “BERT: Pre-training of Deep Bidirectional Transformers for Language Understanding,” in Proceedings of NAACL-HLT (2019), pp. 4171–4186.</w:t>
       </w:r>
     </w:p>
     <w:p>
@@ -2180,7 +3326,7 @@
         <w:pStyle w:val="Reference"/>
       </w:pPr>
       <w:r>
-        <w:t xml:space="preserve">He, K., Zhang, X., Ren, S., Sun, J.: Deep Residual Learning for Image Recognition. In: Proceedings of CVPR, pp. 770–778 (2016).</w:t>
+        <w:t xml:space="preserve">K. He, X. Zhang, S. Ren, and J. Sun, “Deep Residual Learning for Image Recognition,” in Proceedings of CVPR (2016), pp. 770–778.</w:t>
       </w:r>
     </w:p>
     <w:p>
@@ -2188,7 +3334,7 @@
         <w:pStyle w:val="Reference"/>
       </w:pPr>
       <w:r>
-        <w:t xml:space="preserve">He, K., Fan, H., Wu, Y., Xie, S., Girshick, R.: Momentum Contrast for Unsupervised Visual Representation Learning. In: Proceedings of CVPR, pp. 9729–9738 (2020).</w:t>
+        <w:t xml:space="preserve">K. He, H. Fan, Y. Wu, S. Xie, and R. Girshick, “Momentum Contrast for Unsupervised Visual Representation Learning,” in Proceedings of CVPR (2020), pp. 9729–9738.</w:t>
       </w:r>
     </w:p>
     <w:p>
@@ -2196,7 +3342,7 @@
         <w:pStyle w:val="Reference"/>
       </w:pPr>
       <w:r>
-        <w:t xml:space="preserve">Lewis, P., Perez, E., Piktus, A., Petroni, F., Karpukhin, V., Goyal, N., Küttler, H., Lewis, M., Yih, W., Rocktäschel, T., Riedel, S., Kiela, D.: Retrieval-Augmented Generation for Knowledge-Intensive NLP Tasks. In: Advances in Neural Information Processing Systems 33, pp. 9459–9474 (2020).</w:t>
+        <w:t xml:space="preserve">P. Lewis et al., “Retrieval-Augmented Generation for Knowledge-Intensive NLP Tasks,” in Advances in Neural Information Processing Systems 33 (2020), pp. 9459–9474.</w:t>
       </w:r>
     </w:p>
     <w:p>
@@ -2204,7 +3350,7 @@
         <w:pStyle w:val="Reference"/>
       </w:pPr>
       <w:r>
-        <w:t xml:space="preserve">Ji, S., Pan, S., Cambria, E., Marttinen, P., Yu, P.S.: A Survey on Knowledge Graphs: Representation, Acquisition, and Applications. IEEE Transactions on Neural Networks and Learning Systems 33(2), 494–514 (2022).</w:t>
+        <w:t xml:space="preserve">S. Ji, S. Pan, E. Cambria, P. Marttinen, and P. S. Yu, IEEE Trans. Neural Netw. Learn. Syst. 33, 494–514 (2022).</w:t>
       </w:r>
     </w:p>
     <w:p>
@@ -2212,7 +3358,23 @@
         <w:pStyle w:val="Reference"/>
       </w:pPr>
       <w:r>
-        <w:t xml:space="preserve">Hagberg, A.A., Schult, D.A., Swart, P.J.: Exploring Network Structure, Dynamics, and Function using NetworkX. In: Proceedings of the 7th Python in Science Conference, pp. 11–15 (2008).</w:t>
+        <w:t xml:space="preserve">A. A. Hagberg, D. A. Schult, and P. J. Swart, “Exploring Network Structure, Dynamics, and Function using NetworkX,” in Proceedings of the 7th Python in Science Conference (2008), pp. 11–15.</w:t>
+      </w:r>
+    </w:p>
+    <w:p>
+      <w:pPr>
+        <w:pStyle w:val="Reference"/>
+      </w:pPr>
+      <w:r>
+        <w:t xml:space="preserve">G. Salton and C. Buckley, Inf. Process. Manag. 24, 513–523 (1988).</w:t>
+      </w:r>
+    </w:p>
+    <w:p>
+      <w:pPr>
+        <w:pStyle w:val="Reference"/>
+      </w:pPr>
+      <w:r>
+        <w:t xml:space="preserve">V. D. Blondel, J.-L. Guillaume, R. Lambiotte, and E. Lefebvre, J. Stat. Mech. 2008, P10008 (2008).</w:t>
       </w:r>
     </w:p>
     <w:sectPr>

</xml_diff>